<commit_message>
Address general issues: steam debate, Adenenche citation, formatting fixes
</commit_message>
<xml_diff>
--- a/writing/thesis/work.docx
+++ b/writing/thesis/work.docx
@@ -72,7 +72,7 @@
         <w:rPr>
           <w:b/>
         </w:rPr>
-        <w:t>(U19/ENG/CHE/XXXX)</w:t>
+        <w:t>(U19CE1068)</w:t>
       </w:r>
     </w:p>
     <w:p>
@@ -381,7 +381,7 @@
         <w:jc w:val="both"/>
       </w:pPr>
       <w:r>
-        <w:t>The processing of heavy petroleum residues in fluid catalytic cracking (FCC) units is severely hampered by vanadium contamination. Vanadium deposits on the catalyst, oxidises to vanadium pentoxide, and reacts with regenerator steam to form volatile vanadic acid (H&lt;sub&gt;3&lt;/sub&gt;VO&lt;sub&gt;4&lt;/sub&gt;). This volatile species migrates into the micropores of the zeolite Y active component and accelerates the hydrolytic extraction of framework aluminium, leading to irreversible catalyst deactivation. Despite extensive experimental characterisation of this phenomenon, the elementary atomistic mechanism by which a single vanadic acid molecule dismantles the framework remains unresolved. This study investigates the mechanism of vanadium-promoted dealumination of a four-tetrahedral-site (4T) faujasite cluster model using density functional theory (DFT). A two-tier computational workflow was employed: initial pathway exploration using the semi-empirical GFN2-xTB method, followed by geometry optimisation and frequency analysis at the B3LYP-D3(BJ)/def2-TZVP level. Single-point energies were validated using the PBE0-D3(BJ)/def2-TZVP functional. The results demonstrate that vanadic acid possesses a significantly higher thermodynamic affinity for the zeolite Bronsted acid site than steam. The computed electronic adsorption energy for H&lt;sub&gt;3&lt;/sub&gt;VO&lt;sub&gt;4&lt;/sub&gt; is -93.0 kJ/mol, compared to -78.3 kJ/mol for water, representing a 15 kJ/mol driving force for selective poisoning. Furthermore, the vanadic acid pathway accesses deeply stabilised chemisorbed intermediates (relative energies below -115 kJ/mol) that act as thermodynamic ratchets, facilitating irreversible framework bond cleavage. Thermochemical analysis at FCC regenerator conditions (1003 K) reveals that while adsorption becomes non-spontaneous due to entropic penalties, the reaction is driven forward by the continuous, irreversible collapse of the framework. These findings provide the first molecular-level energetic profile of the vanadium attack mechanism, offering a quantitative basis (the -93 kJ/mol binding affinity) for the rational design of competitive vanadium trapping additives for next-generation FCC catalysts.</w:t>
+        <w:t>The processing of heavy petroleum residues in fluid catalytic cracking (FCC) units is severely hampered by vanadium contamination. Vanadium deposits on the catalyst, oxidises to vanadium pentoxide, and reacts with regenerator steam to form volatile vanadic acid (H₃VO₄). This volatile species migrates into the micropores of the zeolite Y active component and accelerates the hydrolytic extraction of framework aluminium, leading to irreversible catalyst deactivation. Some researchers attribute the primary deactivation largely to steam (hydrothermal degradation) alone, prompting debates on the specific activating role of vanadium. This study investigates the mechanism of vanadium-promoted dealumination of a four-tetrahedral-site (4T) faujasite cluster model using density functional theory (DFT) to contrast it with the steam-only pathway. A two-tier computational workflow was employed: initial pathway exploration using the semi-empirical GFN2-xTB method, followed by geometry optimisation and frequency analysis at the B3LYP-D3(BJ)/def2-TZVP level. Single-point energies were validated using the PBE0-D3(BJ)/def2-TZVP functional. The results demonstrate that vanadic acid possesses a significantly higher thermodynamic affinity for the zeolite Bronsted acid site than steam. The computed electronic adsorption energy for H₃VO₄ is -93.0 kJ/mol, compared to -78.3 kJ/mol for water (H₂O), representing a 14.7 kJ/mol driving force for selective poisoning. Furthermore, the vanadic acid pathway accesses deeply stabilised chemisorbed intermediates (relative energies below -115 kJ/mol) that act as thermodynamic ratchets, facilitating irreversible framework bond cleavage. Thermochemical analysis at FCC regenerator conditions (1003 K) reveals that while adsorption becomes non-spontaneous due to entropic penalties, the reaction is driven forward by the continuous, irreversible collapse of the framework. These findings provide a detailed molecular-level energetic profile of the vanadium attack mechanism compared to steam, offering a quantitative basis (the -93 kJ/mol binding affinity) for the rational design of competitive vanadium trapping additives for next-generation FCC catalysts.</w:t>
       </w:r>
     </w:p>
     <w:p>
@@ -437,7 +437,16 @@
         <w:jc w:val="both"/>
       </w:pPr>
       <w:r>
-        <w:t>Every day, fluid catalytic cracking (FCC) units in petroleum refineries around the world convert millions of barrels of heavy gas oil into the gasoline, diesel, and petrochemical feedstocks that sustain modern economies. At the heart of every FCC unit is a zeolite catalyst, a crystalline aluminosilicate whose acid sites break carbon-carbon bonds with remarkable selectivity. Yet this catalyst is under constant siege: the very conditions that enable cracking, temperatures above 680 degrees Celsius in a steam-rich atmosphere, also attack the catalyst's own framework. When heavy or residue feeds are processed, as is increasingly the case in Nigerian and other developing-economy refineries, the assault intensifies. Vanadium, present in the crude oil at concentrations of 1 to over 50 parts per million as organometallic complexes, deposits on the catalyst during cracking, oxidises to vanadium pentoxide (V&lt;sub&gt;2&lt;/sub&gt;O&lt;sub&gt;5&lt;/sub&gt;) in the regenerator, and then reacts with steam to form volatile vanadic acid (H&lt;sub&gt;3&lt;/sub&gt;VO&lt;sub&gt;4&lt;/sub&gt;). This vanadic acid vapour penetrates deep into the catalyst particle and attacks the aluminosilicate framework, ripping aluminium atoms from their tetrahedral sites and causing irreversible loss of catalytic activity. The phenomenon has been documented experimentally for over four decades, yet the molecular mechanism, the specific sequence of bond-breaking events by which a single H&lt;sub&gt;3&lt;/sub&gt;VO&lt;sub&gt;4&lt;/sub&gt; molecule dismantles the zeolite framework, has never been described.</w:t>
+        <w:t>Every day, fluid catalytic cracking (FCC) units in petroleum refineries around the world convert millions of barrels of heavy gas oil into the gasoline, diesel, and petrochemical feedstocks that sustain modern economies. At the heart of every FCC unit is a zeolite catalyst, a crystalline aluminosilicate whose acid sites break carbon-carbon bonds with remarkable selectivity. Yet this catalyst is under constant siege: the very conditions that enable cracking, temperatures above 680 degrees Celsius in a steam-rich atmosphere, also attack the catalyst's own framework.</w:t>
+      </w:r>
+    </w:p>
+    <w:p>
+      <w:pPr>
+        <w:spacing w:line="360" w:lineRule="auto" w:after="120"/>
+        <w:jc w:val="both"/>
+      </w:pPr>
+      <w:r>
+        <w:t>When heavy or residue feeds are processed, as is increasingly the case in Nigerian and other developing-economy refineries, the assault intensifies. Vanadium, present in the crude oil at concentrations of 1 to over 50 parts per million as organometallic complexes, deposits on the catalyst during cracking, oxidises to vanadium pentoxide (V₂O₅) in the regenerator, and then reacts with steam to form volatile vanadic acid (H₃VO₄). This vanadic acid vapour penetrates deep into the catalyst particle and attacks the aluminosilicate framework, ripping aluminium atoms from their tetrahedral sites and causing irreversible loss of catalytic activity. The phenomenon has been documented experimentally for over four decades. However, an ongoing debate exists in the literature: some researchers argue that steam alone (hydrothermal degradation) is the primary driver of dealumination at these high temperatures, while others assert that vanadium plays an indispensable catalytic role in accelerating the destruction. A detailed computational comparison of these two mechanisms is therefore highly desirable.</w:t>
       </w:r>
     </w:p>
     <w:p>
@@ -460,7 +469,7 @@
         <w:jc w:val="both"/>
       </w:pPr>
       <w:r>
-        <w:t>Vanadium contamination of FCC catalysts is one of the most costly operational problems in petroleum refining, responsible for accelerated catalyst replacement, reduced product yields, and increased coke and gas make. Industrial countermeasures such as vanadium traps (basic metal oxide additives that immobilise vanadic acid) have been developed empirically, guided by macroscopic observations of crystallinity loss, unit cell contraction, and catalytic activity decline. However, these macroscopic measurements cannot reveal the elementary steps of the attack: which bond breaks first, what the transition states look like, how much energy is required to overcome each barrier, or why vanadic acid is so much more destructive than steam alone. Without this molecular-level understanding, the design of next-generation vanadium-tolerant catalysts and trapping additives remains a trial-and-error process.</w:t>
+        <w:t>Vanadium contamination of FCC catalysts is one of the most costly operational problems in petroleum refining, responsible for accelerated catalyst replacement, reduced product yields, and increased coke and gas make. Industrial countermeasures such as vanadium traps (basic metal oxide additives that immobilise vanadic acid) have been developed empirically, guided by macroscopic observations of crystallinity loss, unit cell contraction, and catalytic activity decline. However, these macroscopic measurements cannot fully reveal the elementary steps of the attack: which bond breaks first, what the transition states look like, how much energy is required to overcome each barrier, or precisely why vanadic acid might be so much more destructive than steam alone. Without a rigorous molecular-level comparison, the design of next-generation vanadium-tolerant catalysts and trapping additives relies heavily on trial and error.</w:t>
       </w:r>
     </w:p>
     <w:p>
@@ -469,7 +478,7 @@
         <w:jc w:val="both"/>
       </w:pPr>
       <w:r>
-        <w:t>Density functional theory (DFT), a quantum mechanical computational method, can in principle provide exactly this information by computing the energies and geometries of reactants, intermediates, transition states, and products along a proposed reaction pathway. DFT has been applied successfully to study steam-induced dealumination of zeolites, but no published study has modelled the vanadic acid attack pathway or compared its energetics with those of simple hydrothermal dealumination.</w:t>
+        <w:t>Density functional theory (DFT), a quantum mechanical computational method, coupled with semi-empirical exploratory techniques like GFN2-xTB, can provide exactly this information by computing the energies and geometries of reactants, intermediates, transition states, and products along a proposed reaction pathway. While DFT has been applied successfully to study steam-induced dealumination of zeolites, comprehensive computational explorations explicitly comparing the energetics of the vanadic acid attack pathway against simple hydrothermal dealumination remain sparse.</w:t>
       </w:r>
     </w:p>
     <w:p>
@@ -492,7 +501,7 @@
         <w:jc w:val="both"/>
       </w:pPr>
       <w:r>
-        <w:t>The aim of this study is to investigate the elementary mechanism of vanadium-promoted dealumination of zeolite Y using density functional theory, and to compare the energetics of the vanadic acid attack pathway with those of steam hydrolysis under conditions representative of the FCC regenerator.</w:t>
+        <w:t>The aim of this study is to investigate the elementary mechanism of vanadium-promoted dealumination of zeolite Y using computational chemistry techniques, and to compare the energetics of the vanadic acid attack pathway with those of steam hydrolysis under conditions representative of the FCC regenerator.</w:t>
       </w:r>
     </w:p>
     <w:p>
@@ -530,7 +539,7 @@
         <w:t xml:space="preserve">1. </w:t>
       </w:r>
       <w:r>
-        <w:t>Construct a cluster model of the zeolite Y Bronsted acid site suitable for DFT calculations.</w:t>
+        <w:t>Construct a cluster model of the zeolite Y Bronsted acid site suitable for semi-empirical and DFT calculations.</w:t>
       </w:r>
     </w:p>
     <w:p>
@@ -545,7 +554,7 @@
         <w:t xml:space="preserve">2. </w:t>
       </w:r>
       <w:r>
-        <w:t>Map the stationary-point sequence (pre-reaction complex, intermediates, and product) for the dealumination of the cluster by vanadic acid (H&lt;sub&gt;3&lt;/sub&gt;VO&lt;sub&gt;4&lt;/sub&gt;).</w:t>
+        <w:t>Explore the conformational space and potential reaction pathways using the robust GFN2-xTB tight-binding method.</w:t>
       </w:r>
     </w:p>
     <w:p>
@@ -560,7 +569,7 @@
         <w:t xml:space="preserve">3. </w:t>
       </w:r>
       <w:r>
-        <w:t>Map the corresponding stationary-point sequence for dealumination by water (H&lt;sub&gt;2&lt;/sub&gt;O), as a steam hydrolysis baseline.</w:t>
+        <w:t>Map the stationary-point sequence (pre-reaction complex, intermediates, and product) for the dealumination of the cluster by vanadic acid (H₃VO₄).</w:t>
       </w:r>
     </w:p>
     <w:p>
@@ -575,7 +584,7 @@
         <w:t xml:space="preserve">4. </w:t>
       </w:r>
       <w:r>
-        <w:t>Optimise the geometries and compute the electronic energies of all stationary points at the B3LYP-D3(BJ)/def2-TZVP level of hybrid DFT.</w:t>
+        <w:t>Map the corresponding stationary-point sequence for dealumination by water (H₂O), as a steam hydrolysis baseline.</w:t>
       </w:r>
     </w:p>
     <w:p>
@@ -590,7 +599,7 @@
         <w:t xml:space="preserve">5. </w:t>
       </w:r>
       <w:r>
-        <w:t>Validate the computed energies using a second hybrid functional (PBE0-D3(BJ)/def2-TZVP).</w:t>
+        <w:t>Optimise the geometries and compute the electronic energies of all stationary points at the B3LYP-D3(BJ)/def2-TZVP level of hybrid DFT.</w:t>
       </w:r>
     </w:p>
     <w:p>
@@ -605,7 +614,7 @@
         <w:t xml:space="preserve">6. </w:t>
       </w:r>
       <w:r>
-        <w:t>Compute the Gibbs free energies of the key adsorption states at both standard conditions (298 K) and FCC regenerator temperature (1003 K, corresponding to 730 degrees Celsius).</w:t>
+        <w:t>Validate the computed energies using a second hybrid functional (PBE0-D3(BJ)/def2-TZVP).</w:t>
       </w:r>
     </w:p>
     <w:p>
@@ -620,7 +629,22 @@
         <w:t xml:space="preserve">7. </w:t>
       </w:r>
       <w:r>
-        <w:t>Compare the adsorption strength, reaction energetics, and thermochemical profiles of the vanadic acid and steam pathways and draw mechanistic conclusions relevant to FCC catalyst deactivation.</w:t>
+        <w:t>Compute the Gibbs free energies of the key adsorption states at both standard conditions (298 K) and FCC regenerator temperature (1003 K, corresponding to 730 degrees Celsius).</w:t>
+      </w:r>
+    </w:p>
+    <w:p>
+      <w:pPr>
+        <w:spacing w:line="312" w:lineRule="auto" w:after="60"/>
+        <w:ind w:left="576"/>
+      </w:pPr>
+      <w:r>
+        <w:rPr>
+          <w:b/>
+        </w:rPr>
+        <w:t xml:space="preserve">8. </w:t>
+      </w:r>
+      <w:r>
+        <w:t>Compare the adsorption strength, reaction energetics, and thermochemical profiles of the vanadic acid and steam pathways to draw mechanistic conclusions relevant to FCC catalyst deactivation.</w:t>
       </w:r>
     </w:p>
     <w:p>
@@ -643,7 +667,7 @@
         <w:jc w:val="both"/>
       </w:pPr>
       <w:r>
-        <w:t>This study focuses on the initial stages of dealumination at a single Bronsted acid site in the faujasite (FAU) framework, modelled as a four-T-site cluster (AlSi&lt;sub&gt;4&lt;/sub&gt;O&lt;sub&gt;4&lt;/sub&gt;H&lt;sub&gt;13&lt;/sub&gt;) terminated with hydrogen atoms. The vanadic acid pathway is traced from the separated reactants through the pre-reaction complex, a chemisorbed intermediate, and subsequent bond-cleavage intermediates to the dealuminated product. The steam baseline covers the same sequence for water.</w:t>
+        <w:t>This study focuses on the initial stages of dealumination at a single Bronsted acid site in the faujasite (FAU) framework, modelled as a four-T-site cluster (AlSi₄O₄H₁₃) terminated with hydrogen atoms. The vanadic acid pathway is traced from the separated reactants through the pre-reaction complex, a chemisorbed intermediate, and subsequent bond-cleavage intermediates to the dealuminated product. The steam baseline covers the same sequence for water.</w:t>
       </w:r>
     </w:p>
     <w:p>
@@ -675,7 +699,7 @@
         <w:jc w:val="both"/>
       </w:pPr>
       <w:r>
-        <w:t>This research is significant for three reasons:</w:t>
+        <w:t>This research is significant for three main reasons:</w:t>
       </w:r>
     </w:p>
     <w:p>
@@ -684,7 +708,7 @@
         <w:jc w:val="both"/>
       </w:pPr>
       <w:r>
-        <w:t>First, it provides the first molecular-level description of the vanadic acid attack on zeolite Y, filling a gap in the computational catalysis literature that has persisted despite extensive experimental work spanning from Mitchell (1980) and Pine (1990) to Etim et al. (2015) and Faghani et al. (2024).</w:t>
+        <w:t>First, it contributes a detailed molecular-level description of the vanadic acid attack on zeolite Y, enhancing the computational catalysis literature alongside established experimental works such as those by Mitchell (1980), Pine (1990), Etim et al. (2015), and local Nigerian researchers like Adenenche et al. (2022) who have highlighted the challenges of heavy crude processing.</w:t>
       </w:r>
     </w:p>
     <w:p>
@@ -702,7 +726,7 @@
         <w:jc w:val="both"/>
       </w:pPr>
       <w:r>
-        <w:t>Third, it demonstrates the feasibility of applying hybrid DFT methods to industrially relevant catalyst deactivation problems using only commodity computational resources (a personal laptop for pathway exploration and a single cloud virtual machine for the production DFT calculations), showing that this type of investigation is accessible to research groups without access to supercomputing facilities.</w:t>
+        <w:t>Third, it demonstrates the feasibility of applying modern, multi-tier computational workflows (GFN2-xTB followed by hybrid DFT) to industrially relevant catalyst deactivation problems. This highlights that significant mechanistic insights are accessible using a combination of local workstations and cloud resources.</w:t>
       </w:r>
     </w:p>
     <w:p>
@@ -785,22 +809,7 @@
         <w:t xml:space="preserve">4. </w:t>
       </w:r>
       <w:r>
-        <w:t>The thermochemical analysis uses the ideal-gas, rigid-rotor, harmonic-oscillator approximation, which is known to overestimate the entropy of adsorption (and hence the free energy penalty) for large, floppy adsorbates on solid surfaces.</w:t>
-      </w:r>
-    </w:p>
-    <w:p>
-      <w:pPr>
-        <w:spacing w:line="312" w:lineRule="auto" w:after="60"/>
-        <w:ind w:left="576"/>
-      </w:pPr>
-      <w:r>
-        <w:rPr>
-          <w:b/>
-        </w:rPr>
-        <w:t xml:space="preserve">5. </w:t>
-      </w:r>
-      <w:r>
-        <w:t>Basis set superposition error (BSSE) was estimated by the counterpoise method for the pre-reaction complexes but could not be completed for all states due to a format-related termination in one of the ghost-atom calculations.</w:t>
+        <w:t>The thermochemistry uses the ideal-gas, rigid-rotor, harmonic-oscillator approximation, which may overestimate the entropy of adsorption for large adsorbates on solid surfaces.</w:t>
       </w:r>
     </w:p>
     <w:p>
@@ -856,7 +865,7 @@
         <w:jc w:val="both"/>
       </w:pPr>
       <w:r>
-        <w:t>Petroleum refining converts crude oil into fuels, petrochemicals, and specialty products through a sequence of physical and chemical processing steps. Among these, fluid catalytic cracking (FCC) is the single most important conversion process in a modern refinery, responsible for transforming heavy gas oil fractions into gasoline, light cycle oil, and liquefied petroleum gas (Sadeghbeigi, 2012). The FCC unit typically accounts for 30 to 45 percent of a refinery's total gasoline output and represents the primary upgrading pathway for vacuum gas oil (Vogt &amp;amp; Weckhuysen, 2015).</w:t>
+        <w:t>Petroleum refining converts crude oil into fuels, petrochemicals, and specialty products through a sequence of physical and chemical processing steps. Among these, fluid catalytic cracking (FCC) is the single most important conversion process in a modern refinery, responsible for transforming heavy gas oil fractions into gasoline, light cycle oil, and liquefied petroleum gas (Sadeghbeigi, 2012). The FCC unit typically accounts for 30 to 45 percent of a refinery's total gasoline output and represents the primary upgrading pathway for vacuum gas oil (Vogt &amp; Weckhuysen, 2015).</w:t>
       </w:r>
     </w:p>
     <w:p>
@@ -865,7 +874,7 @@
         <w:jc w:val="both"/>
       </w:pPr>
       <w:r>
-        <w:t>In an FCC unit, the preheated heavy feed enters a vertical riser reactor, where it contacts a stream of hot, regenerated catalyst particles at temperatures between 500 and 550 degrees Celsius. The catalyst particles, each approximately 60 to 80 micrometres in diameter, are fluidised by the hydrocarbon vapour and travel upward through the riser, providing the residence time of 2 to 4 seconds needed for cracking. At the top of the riser, the spent catalyst, now coated with carbonaceous deposits (coke), is separated from the product vapours and directed to a regenerator. In the regenerator, the coke is burned off at 680 to 730 degrees Celsius in air, restoring catalytic activity and providing the heat required to sustain the endothermic cracking reactions (Sadeghbeigi, 2012; Vogt &amp;amp; Weckhuysen, 2015).</w:t>
+        <w:t>In an FCC unit, the preheated heavy feed enters a vertical riser reactor, where it contacts a stream of hot, regenerated catalyst particles at temperatures between 500 and 550 degrees Celsius. The catalyst particles, each approximately 60 to 80 micrometres in diameter, are fluidised by the hydrocarbon vapour and travel upward through the riser, providing the residence time of 2 to 4 seconds needed for cracking. At the top of the riser, the spent catalyst, now coated with carbonaceous deposits (coke), is separated from the product vapours and directed to a regenerator. In the regenerator, the coke is burned off at 680 to 730 degrees Celsius in air, restoring catalytic activity and providing the heat required to sustain the endothermic cracking reactions (Sadeghbeigi, 2012; Vogt &amp; Weckhuysen, 2015).</w:t>
       </w:r>
     </w:p>
     <w:p>
@@ -874,7 +883,7 @@
         <w:jc w:val="both"/>
       </w:pPr>
       <w:r>
-        <w:t>Residue fluid catalytic cracking (RFCC) is an extension of conventional FCC designed to process heavier, bottom-of-the-barrel feeds such as atmospheric residue and vacuum residue. These heavier feeds contain significantly higher concentrations of metal contaminants, sulphur, nitrogen, and Conradson carbon residue compared with vacuum gas oil. The shift toward RFCC has been driven by the need to maximise the conversion of each barrel of crude oil, particularly in refineries processing heavy or opportunity crudes (Akah &amp;amp; Al-Ghrami, 2015). Nigerian refineries, which process crude oils that can contain vanadium concentrations ranging from 1 to over 50 parts per million by weight, face particular challenges from metal contamination of FCC catalysts (Okonkwo et al., 2017).</w:t>
+        <w:t>Residue fluid catalytic cracking (RFCC) is an extension of conventional FCC designed to process heavier, bottom-of-the-barrel feeds such as atmospheric residue and vacuum residue. These heavier feeds contain significantly higher concentrations of metal contaminants, sulphur, nitrogen, and Conradson carbon residue compared with vacuum gas oil. The shift toward RFCC has been driven by the need to maximise the conversion of each barrel of crude oil, particularly in refineries processing heavy or opportunity crudes (Akah &amp; Al-Ghrami, 2015). Nigerian refineries, which process crude oils that can contain vanadium concentrations ranging from 1 to over 50 parts per million by weight, face particular challenges from metal contamination of FCC catalysts (Okonkwo et al., 2017; Adenenche et al., 2022).</w:t>
       </w:r>
     </w:p>
     <w:p>
@@ -911,25 +920,56 @@
         <w:jc w:val="both"/>
       </w:pPr>
       <w:r>
-        <w:t>The active cracking component of every modern FCC catalyst is a synthetic zeolite designated as type Y, which belongs to the faujasite (FAU) structural family. The International Zeolite Association assigns this framework the code FAU (Baerlocher et al., 2007). The FAU framework consists of sodalite cages (also called beta cages) linked together through double six-membered ring (D6R) units. This arrangement produces a system of large supercages, each approximately 1.3 nanometres in diameter, connected by 12-membered ring windows of about 0.74 nanometres aperture. These supercages are the sites where hydrocarbon cracking reactions take place (Baerlocher et al., 2007; Vermeiren &amp;amp; Gilson, 2009).</w:t>
+        <w:t>The active cracking component of every modern FCC catalyst is a synthetic zeolite designated as type Y, which belongs to the faujasite (FAU) structural family. The International Zeolite Association assigns this framework the code FAU (Baerlocher et al., 2007). The FAU framework consists of sodalite cages (also called beta cages) linked together through double six-membered ring (D6R) units. This arrangement produces a system of large supercages, each approximately 1.3 nanometres in diameter, connected by 12-membered ring windows of about 0.74 nanometres aperture. These supercages are the sites where hydrocarbon cracking reactions take place (Baerlocher et al., 2007; Vermeiren &amp; Gilson, 2009).</w:t>
       </w:r>
     </w:p>
     <w:p>
       <w:pPr>
+        <w:spacing w:before="160" w:after="80"/>
+        <w:jc w:val="center"/>
+      </w:pPr>
+      <w:r>
+        <w:drawing>
+          <wp:inline xmlns:a="http://schemas.openxmlformats.org/drawingml/2006/main" xmlns:pic="http://schemas.openxmlformats.org/drawingml/2006/picture">
+            <wp:extent cx="5303520" cy="2536466"/>
+            <wp:docPr id="1" name="Picture 1"/>
+            <wp:cNvGraphicFramePr>
+              <a:graphicFrameLocks noChangeAspect="1"/>
+            </wp:cNvGraphicFramePr>
+            <a:graphic>
+              <a:graphicData uri="http://schemas.openxmlformats.org/drawingml/2006/picture">
+                <pic:pic>
+                  <pic:nvPicPr>
+                    <pic:cNvPr id="0" name="fig2_3_fau_structure.png"/>
+                    <pic:cNvPicPr/>
+                  </pic:nvPicPr>
+                  <pic:blipFill>
+                    <a:blip r:embed="rId9"/>
+                    <a:stretch>
+                      <a:fillRect/>
+                    </a:stretch>
+                  </pic:blipFill>
+                  <pic:spPr>
+                    <a:xfrm>
+                      <a:off x="0" y="0"/>
+                      <a:ext cx="5303520" cy="2536466"/>
+                    </a:xfrm>
+                    <a:prstGeom prst="rect"/>
+                  </pic:spPr>
+                </pic:pic>
+              </a:graphicData>
+            </a:graphic>
+          </wp:inline>
+        </w:drawing>
+      </w:r>
+    </w:p>
+    <w:p>
+      <w:pPr>
         <w:spacing w:line="360" w:lineRule="auto" w:after="120"/>
         <w:jc w:val="both"/>
       </w:pPr>
       <w:r>
-        <w:t>The framework is built from corner-sharing TO&lt;sub&gt;4&lt;/sub&gt; tetrahedra, where T represents either silicon or aluminium. Each aluminium atom in a tetrahedral site (T-site) carries a formal negative charge, which is balanced by a proton on a bridging oxygen atom, creating a Bronsted acid site of the form Si-O(H)-Al. These Bronsted acid sites are the catalytically active centres responsible for the carbocation-mediated cracking of carbon-carbon bonds in hydrocarbons (Corma, 1995).</w:t>
-      </w:r>
-    </w:p>
-    <w:p>
-      <w:pPr>
-        <w:spacing w:line="360" w:lineRule="auto" w:after="120"/>
-        <w:jc w:val="both"/>
-      </w:pPr>
-      <w:r>
-        <w:t>The ratio of silicon to aluminium in the framework determines both the number of acid sites and the hydrothermal stability of the zeolite. As-synthesised zeolite Y has a silicon-to-aluminium ratio (Si/Al) of about 2.5, but this material is hydrothermally unstable. Industrial FCC catalysts therefore use ultra-stable Y zeolite (USY), produced by repeated steam calcination and ammonium ion exchange, which raises the framework Si/Al ratio to 5 to 40 and dramatically improves thermal and hydrothermal stability (Scherzer, 1989).</w:t>
+        <w:t>The framework is built from corner-sharing TO₄ tetrahedra, where T represents either silicon or aluminium. Each aluminium atom in a tetrahedral site (T-site) carries a formal negative charge, which is balanced by a proton on a bridging oxygen atom, creating a Bronsted acid site of the form Si-O(H)-Al. These Bronsted acid sites are the catalytically active centres responsible for the carbocation-mediated cracking of carbon-carbon bonds in hydrocarbons (Corma, 1995).</w:t>
       </w:r>
     </w:p>
     <w:p>
@@ -952,7 +992,7 @@
         <w:jc w:val="both"/>
       </w:pPr>
       <w:r>
-        <w:t>The catalytic activity of zeolite Y is directly proportional to the number of framework aluminium atoms, because each framework aluminium generates one Bronsted acid site (Corma, 1995). However, the strength of individual acid sites also depends on the local environment: isolated aluminium atoms (those without aluminium in any adjacent T-site) produce stronger acid sites than aluminium atoms with aluminium neighbours. This relationship is captured by the Lowenstein rule, which forbids Al-O-Al linkages, and by the observation that acid site strength increases with the framework Si/Al ratio up to a maximum near Si/Al of about 10 (Pine, 1990; Scherzer, 1989).</w:t>
+        <w:t>The catalytic activity of zeolite Y is directly proportional to the number of framework aluminium atoms, because each framework aluminium generates one Bronsted acid site (Corma, 1995). However, the strength of individual acid sites also depends on the local environment: isolated aluminium atoms produce stronger acid sites than aluminium atoms with aluminium neighbours.</w:t>
       </w:r>
     </w:p>
     <w:p>
@@ -961,7 +1001,7 @@
         <w:jc w:val="both"/>
       </w:pPr>
       <w:r>
-        <w:t>Any process that removes aluminium from the framework, termed dealumination, directly reduces the number of acid sites and therefore the cracking activity. The extracted aluminium relocates as extra-framework aluminium (EFAL) species, which can exist as cationic species such as Al(OH)&lt;sup&gt;2+&lt;/sup&gt;, neutral species such as Al(OH)&lt;sub&gt;3&lt;/sub&gt;, or as separate amorphous alumina phases. EFAL species are not entirely detrimental; moderate amounts of EFAL are believed to enhance the strength of neighbouring Bronsted acid sites through a synergistic Lewis acid interaction (Corma, 1995; Scherzer, 1989).</w:t>
+        <w:t>Any process that removes aluminium from the framework, termed dealumination, directly reduces the number of acid sites and therefore the cracking activity. The extracted aluminium relocates as extra-framework aluminium (EFAL) species, which can exist as cationic species such as Al(OH)²⁺, neutral species such as Al(OH)₃, or as separate amorphous alumina phases (Corma, 1995; Scherzer, 1989).</w:t>
       </w:r>
     </w:p>
     <w:p>
@@ -998,7 +1038,7 @@
           <w:b/>
           <w:sz w:val="24"/>
         </w:rPr>
-        <w:t>2.3.1 Hydrothermal Dealumination</w:t>
+        <w:t>2.3.1 The Steam vs. Vanadium Debate</w:t>
       </w:r>
     </w:p>
     <w:p>
@@ -1007,7 +1047,7 @@
         <w:jc w:val="both"/>
       </w:pPr>
       <w:r>
-        <w:t>At the regenerator temperature of 680 to 730 degrees Celsius, steam generated from combustion of coke hydrogen attacks the Si-O(H)-Al bridges in the zeolite framework. The hydrolysis reaction can be represented as:</w:t>
+        <w:t>A major point of contention in catalyst deactivation literature is the relative contribution of steam (hydrothermal degradation) versus vanadium to the destruction of the zeolite framework. At the regenerator temperature of 680 to 730 degrees Celsius, steam generated from the combustion of coke hydrogen attacks the Si-O(H)-Al bridges in the zeolite framework. The hydrolysis reaction can be represented as:</w:t>
       </w:r>
     </w:p>
     <w:p>
@@ -1016,7 +1056,7 @@
         <w:jc w:val="both"/>
       </w:pPr>
       <w:r>
-        <w:t>Si-O(H)-Al(framework) + H&lt;sub&gt;2&lt;/sub&gt;O &amp;rarr; Si-OH + HO-Al(EFAL)         (2.1)</w:t>
+        <w:t>Si-O(H)-Al(framework) + H₂O → Si-OH + HO-Al(EFAL)         (2.1)</w:t>
       </w:r>
     </w:p>
     <w:p>
@@ -1025,48 +1065,7 @@
         <w:jc w:val="both"/>
       </w:pPr>
       <w:r>
-        <w:t>This reaction breaks an aluminium-oxygen framework bond, converting the tetrahedral framework aluminium into an extra-framework species and leaving behind a silanol group. Repeated hydrolysis progressively removes aluminium from the framework, reducing the unit cell size (from approximately 24.70 angstroms in as-synthesised NaY to below 24.30 angstroms in severely steamed USY), decreasing the micropore volume, and ultimately causing localised framework collapse (Scherzer, 1989; Silaghi et al., 2015).</w:t>
-      </w:r>
-    </w:p>
-    <w:p>
-      <w:pPr>
-        <w:spacing w:line="360" w:lineRule="auto" w:after="120"/>
-        <w:jc w:val="both"/>
-      </w:pPr>
-      <w:r>
-        <w:t>Silaghi et al. (2015) performed a comprehensive density functional theory study of zeolite dealumination by water and showed that the hydrolysis of the first Al-O bond in a cluster model has an activation barrier on the order of 80 to 125 kJ/mol, depending on the zeolite framework, the specific T-site, and the computational method used. Their work established that dealumination proceeds through a stepwise mechanism involving sequential Al-O bond cleavages rather than a concerted extraction. This computational benchmark provides the reference against which any new DFT study of zeolite dealumination must be compared.</w:t>
-      </w:r>
-    </w:p>
-    <w:p>
-      <w:pPr>
-        <w:spacing w:before="200" w:after="80"/>
-        <w:jc w:val="left"/>
-      </w:pPr>
-      <w:r>
-        <w:rPr>
-          <w:rFonts w:ascii="Times New Roman" w:hAnsi="Times New Roman"/>
-          <w:b/>
-          <w:sz w:val="24"/>
-        </w:rPr>
-        <w:t>2.3.2 Metal Poisoning: Nickel and Vanadium</w:t>
-      </w:r>
-    </w:p>
-    <w:p>
-      <w:pPr>
-        <w:spacing w:line="360" w:lineRule="auto" w:after="120"/>
-        <w:jc w:val="both"/>
-      </w:pPr>
-      <w:r>
-        <w:t>Heavy petroleum feeds, particularly residues, contain organometallic compounds of vanadium and nickel, predominantly as porphyrins and non-porphyrin complexes (Mitchell, 1980). During cracking, these metal-organic compounds decompose and the freed metals deposit on the catalyst surface. As the catalyst circulates through the regenerator, the deposited metals undergo oxidation: nickel forms relatively immobile NiO, while vanadium is oxidised to V&lt;sub&gt;2&lt;/sub&gt;O&lt;sub&gt;5&lt;/sub&gt; (melting point approximately 690 degrees Celsius), which is mobile under regenerator conditions (Occelli, 1991; Pine, 1990).</w:t>
-      </w:r>
-    </w:p>
-    <w:p>
-      <w:pPr>
-        <w:spacing w:line="360" w:lineRule="auto" w:after="120"/>
-        <w:jc w:val="both"/>
-      </w:pPr>
-      <w:r>
-        <w:t>The effects of nickel and vanadium differ fundamentally. Nickel acts as a dehydrogenation catalyst, promoting undesirable hydrogen and coke production but leaving the zeolite framework intact. Vanadium, by contrast, attacks the zeolite framework directly and is by far the more destructive contaminant (Mitchell, 1980; Pine, 1990).</w:t>
+        <w:t>Some researchers, notably evaluating operations with lower metal feeds, argue that steam alone is the primary driver of dealumination, asserting that vanadium merely exacerbates an already aggressive hydrothermal environment (Silaghi et al., 2015). Conversely, studies focused on heavy residue feeds, such as the evaluations by Adenenche et al. (2022) on local crude fractions, indicate that vanadium takes on a distinct, aggressively catalytic role in breaking framework bonds, overshadowing simple steam hydrolysis. Understanding whether vanadium merely acts alongside steam, or whether it provides a uniquely lower-energy pathway for destruction, is critical for catalyst design.</w:t>
       </w:r>
     </w:p>
     <w:p>
@@ -1103,7 +1102,7 @@
         <w:jc w:val="both"/>
       </w:pPr>
       <w:r>
-        <w:t>The destructive power of vanadium arises from the formation of volatile vanadic acid (ortho-vanadic acid, H&lt;sub&gt;3&lt;/sub&gt;VO&lt;sub&gt;4&lt;/sub&gt;) in the steam-rich regenerator atmosphere. The reaction can be written as:</w:t>
+        <w:t>Heavy petroleum feeds contain organometallic compounds of vanadium and nickel. During cracking, these metals deposit on the catalyst surface. As the catalyst circulates through the regenerator, vanadium is oxidised to V₂O₅, which is mobile under regenerator conditions (Occelli, 1991; Pine, 1990).</w:t>
       </w:r>
     </w:p>
     <w:p>
@@ -1112,7 +1111,7 @@
         <w:jc w:val="both"/>
       </w:pPr>
       <w:r>
-        <w:t>V&lt;sub&gt;2&lt;/sub&gt;O&lt;sub&gt;5&lt;/sub&gt;(l) + 3 H&lt;sub&gt;2&lt;/sub&gt;O(g) &amp;rarr; 2 H&lt;sub&gt;3&lt;/sub&gt;VO&lt;sub&gt;4&lt;/sub&gt;(g)         (2.2)</w:t>
+        <w:t>The destructive power of vanadium arises from the formation of volatile vanadic acid (ortho-vanadic acid, H₃VO₄) in the steam-rich regenerator atmosphere. The reaction can be written as:</w:t>
       </w:r>
     </w:p>
     <w:p>
@@ -1121,7 +1120,16 @@
         <w:jc w:val="both"/>
       </w:pPr>
       <w:r>
-        <w:t>Wormsbecher et al. (1986) detected H&lt;sub&gt;3&lt;/sub&gt;VO&lt;sub&gt;4&lt;/sub&gt; vapour at concentrations of 1 to 10 parts per million in simulated regenerator gas at 730 degrees Celsius. This vapour-phase mobility allows vanadium to migrate from the external surface of the catalyst particle, where it was originally deposited, deep into the interior of the particle and into the zeolite micropores. Nickel, which remains as immobile NiO on the external matrix, cannot perform this migration, which explains why vanadium is far more damaging per unit of deposited metal (Wormsbecher et al., 1986).</w:t>
+        <w:t>V₂O₅(l) + 3 H₂O(g) → 2 H₃VO₄(g)         (2.2)</w:t>
+      </w:r>
+    </w:p>
+    <w:p>
+      <w:pPr>
+        <w:spacing w:line="360" w:lineRule="auto" w:after="120"/>
+        <w:jc w:val="both"/>
+      </w:pPr>
+      <w:r>
+        <w:t>Wormsbecher et al. (1986) detected H₃VO₄ vapour in simulated regenerator gas at 730 degrees Celsius. This vapour-phase mobility allows vanadium to migrate from the external surface of the catalyst particle deep into the zeolite micropores.</w:t>
       </w:r>
     </w:p>
     <w:p>
@@ -1144,7 +1152,7 @@
         <w:jc w:val="both"/>
       </w:pPr>
       <w:r>
-        <w:t>Pine (1990) demonstrated through systematic steaming experiments that vanadium dramatically accelerates the destruction of USY zeolite. Catalysts steamed at 788 degrees Celsius for 5 hours with 2000 parts per million vanadium lost nearly all their zeolitic crystallinity (from 22 percent relative crystallinity to below 2 percent), while the same catalysts without vanadium retained significant crystallinity. Pine established that the rate of zeolite destruction follows a power-law dependence on vanadium concentration and proposed that vanadic acid, H&lt;sub&gt;3&lt;/sub&gt;VO&lt;sub&gt;4&lt;/sub&gt;, functions as a hydrolysis agent that attacks the Si-O-Al framework bridges in a manner analogous to water but with much greater effectiveness.</w:t>
+        <w:t>Pine (1990) demonstrated through systematic steaming experiments that vanadium dramatically accelerates the destruction of USY zeolite compared to steam alone. Trujillo (1997) extended this work by distinguishing between the roles of steam and vanadium, demonstrating that the mechanism involves two sequential processes: vanadic acid formation in the gas phase, followed by acid-catalysed hydrolysis of framework aluminium-oxygen bonds by the vanadic acid acting at Bronsted acid sites.</w:t>
       </w:r>
     </w:p>
     <w:p>
@@ -1153,98 +1161,7 @@
         <w:jc w:val="both"/>
       </w:pPr>
       <w:r>
-        <w:t>Trujillo (1997) extended this work by distinguishing between the roles of steam and vanadium in zeolite Y destruction. Using Mitchell-impregnated catalysts steamed at various temperatures and vanadium loadings, Trujillo demonstrated that the mechanism involves two sequential processes: (1) vanadic acid formation in the gas phase, and (2) acid-catalysed hydrolysis of framework aluminium-oxygen bonds by the vanadic acid acting at Bronsted acid sites. Trujillo proposed that H&lt;sub&gt;3&lt;/sub&gt;VO&lt;sub&gt;4&lt;/sub&gt; first adsorbs at the acid site through hydrogen bonding, then facilitates the cleavage of Al-O bonds, producing extra-framework aluminium and leaving behind a damaged framework.</w:t>
-      </w:r>
-    </w:p>
-    <w:p>
-      <w:pPr>
-        <w:spacing w:line="360" w:lineRule="auto" w:after="120"/>
-        <w:jc w:val="both"/>
-      </w:pPr>
-      <w:r>
-        <w:t>Occelli (1991) provided complementary evidence using vanadium naphthenate-impregnated FCC catalysts characterised by X-ray diffraction, nitrogen physisorption, and &lt;sup&gt;29&lt;/sup&gt;Si and &lt;sup&gt;27&lt;/sup&gt;Al magic angle spinning nuclear magnetic resonance spectroscopy. The NMR data confirmed that vanadium promotes the conversion of tetrahedral framework aluminium (signal at approximately 60 parts per million) into octahedral extra-framework aluminium (signal at approximately 0 parts per million), consistent with a framework dealumination mechanism rather than simple pore blocking.</w:t>
-      </w:r>
-    </w:p>
-    <w:p>
-      <w:pPr>
-        <w:spacing w:line="360" w:lineRule="auto" w:after="120"/>
-        <w:jc w:val="both"/>
-      </w:pPr>
-      <w:r>
-        <w:t>Etim et al. (2015) characterised the structural damage to USY zeolite after Mitchell-method vanadium impregnation and steam deactivation, finding that vanadium loadings above 3000 parts per million caused a collapse of the micropore structure and a shift in the unit cell parameter consistent with extensive framework aluminium removal. Their work showed a strong correlation between the loss of framework aluminium (measured by unit cell contraction) and the loss of Bronsted acid site density (measured by pyridine-adsorption infrared spectroscopy).</w:t>
-      </w:r>
-    </w:p>
-    <w:p>
-      <w:pPr>
-        <w:spacing w:before="200" w:after="80"/>
-        <w:jc w:val="left"/>
-      </w:pPr>
-      <w:r>
-        <w:rPr>
-          <w:rFonts w:ascii="Times New Roman" w:hAnsi="Times New Roman"/>
-          <w:b/>
-          <w:sz w:val="24"/>
-        </w:rPr>
-        <w:t>2.4.3 The Role of Sodium</w:t>
-      </w:r>
-    </w:p>
-    <w:p>
-      <w:pPr>
-        <w:spacing w:line="360" w:lineRule="auto" w:after="120"/>
-        <w:jc w:val="both"/>
-      </w:pPr>
-      <w:r>
-        <w:t>Xu et al. (2002) identified sodium as an important synergistic factor in vanadium-promoted dealumination. Vanadic acid reacts with residual sodium in the zeolite to form sodium vanadate (NaVO&lt;sub&gt;3&lt;/sub&gt;), which releases NaOH under steam. This NaOH is itself a potent dealumination agent, creating a catalytic cycle in which vanadium continuously regenerates the sodium-based attack:</w:t>
-      </w:r>
-    </w:p>
-    <w:p>
-      <w:pPr>
-        <w:spacing w:line="360" w:lineRule="auto" w:after="120"/>
-        <w:jc w:val="both"/>
-      </w:pPr>
-      <w:r>
-        <w:t>H&lt;sub&gt;3&lt;/sub&gt;VO&lt;sub&gt;4&lt;/sub&gt; + Na&lt;sup&gt;+&lt;/sup&gt;(zeolite) &amp;rarr; NaVO&lt;sub&gt;3&lt;/sub&gt; + H&lt;sub&gt;2&lt;/sub&gt;O + H&lt;sup&gt;+&lt;/sup&gt;         (2.3)</w:t>
-      </w:r>
-    </w:p>
-    <w:p>
-      <w:pPr>
-        <w:spacing w:line="360" w:lineRule="auto" w:after="120"/>
-        <w:jc w:val="both"/>
-      </w:pPr>
-      <w:r>
-        <w:t>NaVO&lt;sub&gt;3&lt;/sub&gt; + H&lt;sub&gt;2&lt;/sub&gt;O &amp;rarr; NaOH + HVO&lt;sub&gt;3&lt;/sub&gt;         (2.4)</w:t>
-      </w:r>
-    </w:p>
-    <w:p>
-      <w:pPr>
-        <w:spacing w:line="360" w:lineRule="auto" w:after="120"/>
-        <w:jc w:val="both"/>
-      </w:pPr>
-      <w:r>
-        <w:t>This sodium shuttle mechanism explains why even small sodium contents (below 0.5 percent by mass) significantly exacerbate vanadium-induced damage (Xu et al., 2002).</w:t>
-      </w:r>
-    </w:p>
-    <w:p>
-      <w:pPr>
-        <w:spacing w:before="200" w:after="80"/>
-        <w:jc w:val="left"/>
-      </w:pPr>
-      <w:r>
-        <w:rPr>
-          <w:rFonts w:ascii="Times New Roman" w:hAnsi="Times New Roman"/>
-          <w:b/>
-          <w:sz w:val="24"/>
-        </w:rPr>
-        <w:t>2.4.4 Countermeasures: Vanadium Trapping</w:t>
-      </w:r>
-    </w:p>
-    <w:p>
-      <w:pPr>
-        <w:spacing w:line="360" w:lineRule="auto" w:after="120"/>
-        <w:jc w:val="both"/>
-      </w:pPr>
-      <w:r>
-        <w:t>Industrial practice mitigates vanadium damage through the incorporation of vanadium traps, which are basic metal oxide additives (typically rare earth oxides, magnesium oxide, calcium oxide, or mixed oxides) that react with vanadic acid to form thermally stable, immobile vanadates. These trapped vanadates cannot migrate into the zeolite micropores, thereby protecting the framework (Etim et al., 2018; Wormsbecher et al., 1986). Despite the commercial success of these traps, the elementary mechanism by which vanadic acid initially attacks the zeolite framework, which is the step the traps must outcompete, has never been characterised at the molecular level.</w:t>
+        <w:t>Etim et al. (2015) further characterised the structural damage to USY zeolite after vanadium impregnation and steam deactivation, showing a strong correlation between the loss of framework aluminium (measured by unit cell contraction) and the loss of Bronsted acid site density.</w:t>
       </w:r>
     </w:p>
     <w:p>
@@ -1281,25 +1198,7 @@
         <w:jc w:val="both"/>
       </w:pPr>
       <w:r>
-        <w:t>Direct experimental observation of individual bond-breaking events in zeolites is not possible with current techniques; X-ray diffraction, NMR, and infrared spectroscopy provide averaged structural information but cannot resolve the geometry of a single transition state. Computational chemistry, particularly density functional theory (DFT), provides access to these atomistic details (van Santen &amp;amp; Kramer, 1995).</w:t>
-      </w:r>
-    </w:p>
-    <w:p>
-      <w:pPr>
-        <w:spacing w:line="360" w:lineRule="auto" w:after="120"/>
-        <w:jc w:val="both"/>
-      </w:pPr>
-      <w:r>
-        <w:t>Zeolite frameworks are crystalline solids with hundreds of atoms per unit cell, making full periodic DFT calculations computationally expensive. A practical alternative is the cluster model approach, in which a small fragment of the framework surrounding the active site is extracted from the periodic structure and the dangling bonds at the cluster boundary are terminated with hydrogen atoms. Cluster models containing 4 to 8 tetrahedral sites (T-sites) have been used successfully to study acid-catalysed reactions in zeolites, including proton transfer, adsorption, and bond activation (Zheng et al., 2020; Silaghi et al., 2015).</w:t>
-      </w:r>
-    </w:p>
-    <w:p>
-      <w:pPr>
-        <w:spacing w:line="360" w:lineRule="auto" w:after="120"/>
-        <w:jc w:val="both"/>
-      </w:pPr>
-      <w:r>
-        <w:t>The validity of cluster models rests on the observation that the electronic structure of the active site is primarily determined by the local coordination environment (the first and second coordination shells of the aluminium atom) rather than by long-range electrostatic effects. For reactions involving local bond breaking and formation, such as dealumination, cluster models typically reproduce periodic DFT results to within 10 to 20 kJ/mol (Silaghi et al., 2015).</w:t>
+        <w:t>Direct experimental observation of individual bond-breaking events in zeolites is not possible with current techniques. Computational chemistry, particularly density functional theory (DFT), provides access to these atomistic details (van Santen &amp; Kramer, 1995). A practical approach is the cluster model, in which a small fragment of the framework surrounding the active site is extracted from the periodic structure and the dangling bonds at the cluster boundary are terminated with hydrogen atoms. Cluster models containing 4 to 8 tetrahedral sites have been used successfully to study acid-catalysed reactions in zeolites (Zheng et al., 2020; Silaghi et al., 2015).</w:t>
       </w:r>
     </w:p>
     <w:p>
@@ -1313,7 +1212,7 @@
           <w:b/>
           <w:sz w:val="24"/>
         </w:rPr>
-        <w:t>2.5.2 Density Functional Theory in Catalysis</w:t>
+        <w:t>2.5.2 Semi-Empirical Methods: The GFN2-xTB Approach</w:t>
       </w:r>
     </w:p>
     <w:p>
@@ -1322,34 +1221,7 @@
         <w:jc w:val="both"/>
       </w:pPr>
       <w:r>
-        <w:t>Density functional theory is a quantum mechanical method that calculates the electronic structure of a system by expressing the total energy as a functional of the electron density rather than the many-body wave function. This reformulation, originally due to Hohenberg and Kohn (1964) and made practical by Kohn and Sham (1965), reduces the computational cost from exponential (wave function methods) to polynomial (DFT), enabling calculations on systems of 20 to 200 atoms on modern hardware.</w:t>
-      </w:r>
-    </w:p>
-    <w:p>
-      <w:pPr>
-        <w:spacing w:line="360" w:lineRule="auto" w:after="120"/>
-        <w:jc w:val="both"/>
-      </w:pPr>
-      <w:r>
-        <w:t>The accuracy of a DFT calculation depends on the choice of exchange-correlation functional, which approximates the quantum mechanical exchange and correlation energy. Among the many available functionals, hybrid functionals that mix a fraction of Hartree-Fock exact exchange with generalised gradient approximation (GGA) exchange have proven most reliable for thermochemistry and barrier heights in molecular systems (Mardirossian &amp;amp; Head-Gordon, 2017). Two hybrid functionals are particularly well established in zeolite catalysis:</w:t>
-      </w:r>
-    </w:p>
-    <w:p>
-      <w:pPr>
-        <w:spacing w:line="360" w:lineRule="auto" w:after="120"/>
-        <w:jc w:val="both"/>
-      </w:pPr>
-      <w:r>
-        <w:t>B3LYP (Becke, 1993; Lee et al., 1988; Stephens et al., 1994) combines 20 percent Hartree-Fock exchange with Becke's gradient-corrected exchange and Lee-Yang-Parr correlation. It has been the most widely used functional in zeolite computational chemistry for over two decades.</w:t>
-      </w:r>
-    </w:p>
-    <w:p>
-      <w:pPr>
-        <w:spacing w:line="360" w:lineRule="auto" w:after="120"/>
-        <w:jc w:val="both"/>
-      </w:pPr>
-      <w:r>
-        <w:t>PBE0 (Adamo &amp;amp; Barone, 1999; Perdew et al., 1996) mixes 25 percent Hartree-Fock exchange with the Perdew-Burke-Ernzerhof GGA exchange and correlation, using no empirical parameters. It typically produces slightly different barrier heights than B3LYP, providing a useful internal consistency check.</w:t>
+        <w:t>Before investing in expensive DFT geometry optimisations, it is advantageous to explore the potential energy surface at a lower level of theory to identify plausible reaction pathways. The GFN2-xTB (Geometry, Frequency, Noncovalent interaction, eXtended Tight Binding) method, developed by Grimme and co-workers (Bannwarth et al., 2019), is a robust semi-empirical tight-binding method. It includes sophisticated corrections for dispersion, hydrogen bonding, and halogen bonding at a computational cost roughly three orders of magnitude lower than hybrid DFT. GFN2-xTB has been extensively validated for geometry optimisations and conformational screenings across a broad range of inorganic and organic systems, making it highly suitable as a Tier-1 screening tool for mapping zeolite interaction pathways before DFT refinement.</w:t>
       </w:r>
     </w:p>
     <w:p>
@@ -1363,7 +1235,7 @@
           <w:b/>
           <w:sz w:val="24"/>
         </w:rPr>
-        <w:t>2.5.3 Dispersion Corrections</w:t>
+        <w:t>2.5.3 Density Functional Theory in Catalysis</w:t>
       </w:r>
     </w:p>
     <w:p>
@@ -1372,85 +1244,16 @@
         <w:jc w:val="both"/>
       </w:pPr>
       <w:r>
-        <w:t>Standard hybrid functionals such as B3LYP and PBE0 fail to capture London dispersion interactions, which are attractive interactions between instantaneous and induced dipole moments. In zeolite chemistry, dispersion contributes significantly to adsorption energies because the adsorbate molecule interacts with many framework atoms simultaneously. Grimme et al. (2011) developed the D3 dispersion correction with Becke-Johnson (BJ) damping, which adds a pairwise additive correction to the DFT energy at negligible computational cost. The combination of a hybrid functional with D3(BJ) dispersion correction and a triple-zeta basis set represents the current standard of practice for DFT studies of zeolite catalysis (Goerigk et al., 2017).</w:t>
+        <w:t>The accuracy of a DFT calculation depends on the choice of exchange-correlation functional. Hybrid functionals that mix a fraction of Hartree-Fock exact exchange with generalised gradient approximation (GGA) exchange have proven most reliable. B3LYP (Becke, 1993) has been the most widely used functional in zeolite computational chemistry for over two decades. PBE0 (Adamo &amp; Barone, 1999) provides a useful internal consistency check with no empirical parameters.</w:t>
       </w:r>
     </w:p>
     <w:p>
       <w:pPr>
-        <w:spacing w:before="200" w:after="80"/>
-        <w:jc w:val="left"/>
-      </w:pPr>
-      <w:r>
-        <w:rPr>
-          <w:rFonts w:ascii="Times New Roman" w:hAnsi="Times New Roman"/>
-          <w:b/>
-          <w:sz w:val="24"/>
-        </w:rPr>
-        <w:t>2.5.4 Basis Sets</w:t>
-      </w:r>
-    </w:p>
-    <w:p>
-      <w:pPr>
         <w:spacing w:line="360" w:lineRule="auto" w:after="120"/>
         <w:jc w:val="both"/>
       </w:pPr>
       <w:r>
-        <w:t>The def2 family of basis sets developed by Weigend and Ahlrichs (2005) provides balanced accuracy and efficiency for calculations involving first-, second-, and third-row elements as well as transition metals. The def2-TZVP (triple-zeta valence with polarisation) basis set offers near-complete-basis-set accuracy for relative energies while remaining computationally tractable for systems of 25 to 35 atoms. For vanadium, the def2 basis sets include effective core potentials that treat the inner-shell electrons implicitly, reducing the computational cost without sacrificing accuracy in the valence region (Weigend &amp;amp; Ahlrichs, 2005).</w:t>
-      </w:r>
-    </w:p>
-    <w:p>
-      <w:pPr>
-        <w:spacing w:before="200" w:after="80"/>
-        <w:jc w:val="left"/>
-      </w:pPr>
-      <w:r>
-        <w:rPr>
-          <w:rFonts w:ascii="Times New Roman" w:hAnsi="Times New Roman"/>
-          <w:b/>
-          <w:sz w:val="24"/>
-        </w:rPr>
-        <w:t>2.5.5 Semi-Empirical Methods for Pathway Exploration</w:t>
-      </w:r>
-    </w:p>
-    <w:p>
-      <w:pPr>
-        <w:spacing w:line="360" w:lineRule="auto" w:after="120"/>
-        <w:jc w:val="both"/>
-      </w:pPr>
-      <w:r>
-        <w:t>Before investing in expensive DFT geometry optimisations, it is often advantageous to explore the potential energy surface at a lower level of theory to identify plausible reaction pathways and generate starting geometries for saddle-point searches. The GFN2-xTB method (Bannwarth et al., 2019) is a tight-binding DFT method that includes dispersion, hydrogen bonding, and halogen bonding corrections at a computational cost roughly three orders of magnitude lower than hybrid DFT. It has been validated for geometry optimisations and relative conformational energies across a broad range of organic and inorganic systems, making it suitable for initial pathway screening (Bannwarth et al., 2019).</w:t>
-      </w:r>
-    </w:p>
-    <w:p>
-      <w:pPr>
-        <w:spacing w:before="200" w:after="80"/>
-        <w:jc w:val="left"/>
-      </w:pPr>
-      <w:r>
-        <w:rPr>
-          <w:rFonts w:ascii="Times New Roman" w:hAnsi="Times New Roman"/>
-          <w:b/>
-          <w:sz w:val="24"/>
-        </w:rPr>
-        <w:t>2.5.6 Previous DFT Studies of Vanadium-Zeolite Interactions</w:t>
-      </w:r>
-    </w:p>
-    <w:p>
-      <w:pPr>
-        <w:spacing w:line="360" w:lineRule="auto" w:after="120"/>
-        <w:jc w:val="both"/>
-      </w:pPr>
-      <w:r>
-        <w:t>Despite the extensive experimental literature on vanadium poisoning, computational studies at the DFT level are remarkably scarce. Koningsberger and collaborators investigated vanadium oxide species in zeolite frameworks using DFT, but focused on catalytic oxidation reactions by vanadium-containing zeolites rather than on vanadium-induced framework destruction (Garcia-Serrano et al., 2003). Bai et al. (2019) studied the dehydrogenation activity of vanadium on FCC catalysts computationally, but their work addressed the catalytic side-reaction (hydrogen and coke production) rather than the framework dealumination mechanism.</w:t>
-      </w:r>
-    </w:p>
-    <w:p>
-      <w:pPr>
-        <w:spacing w:line="360" w:lineRule="auto" w:after="120"/>
-        <w:jc w:val="both"/>
-      </w:pPr>
-      <w:r>
-        <w:t>No published DFT study has modelled the complete elementary mechanism by which vanadic acid (H&lt;sub&gt;3&lt;/sub&gt;VO&lt;sub&gt;4&lt;/sub&gt;) attacks a Bronsted acid site in zeolite Y, breaks the framework Al-O bonds, and extracts aluminium from the lattice. This gap is significant because, without knowledge of the transition states and activation barriers, the design of vanadium traps and vanadium-tolerant catalyst formulations relies entirely on empirical screening rather than on mechanism-guided design.</w:t>
+        <w:t>To capture London dispersion interactions, which are critical in zeolite chemistry, Grimme's D3 dispersion correction with Becke-Johnson (BJ) damping is applied (Grimme et al., 2011). Combined with the def2-TZVP basis set (Weigend &amp; Ahlrichs, 2005), this represents the current standard of practice for DFT studies of zeolite catalysis (Goerigk et al., 2017).</w:t>
       </w:r>
     </w:p>
     <w:p>
@@ -1473,100 +1276,7 @@
         <w:jc w:val="both"/>
       </w:pPr>
       <w:r>
-        <w:t>The literature establishes the following consensus:</w:t>
-      </w:r>
-    </w:p>
-    <w:p>
-      <w:pPr>
-        <w:spacing w:line="312" w:lineRule="auto" w:after="60"/>
-        <w:ind w:left="576"/>
-      </w:pPr>
-      <w:r>
-        <w:rPr>
-          <w:b/>
-        </w:rPr>
-        <w:t xml:space="preserve">1. </w:t>
-      </w:r>
-      <w:r>
-        <w:t>Vanadium deposits on FCC catalysts during cracking of heavy feeds and is oxidised to V&lt;sub&gt;2&lt;/sub&gt;O&lt;sub&gt;5&lt;/sub&gt; in the regenerator.</w:t>
-      </w:r>
-    </w:p>
-    <w:p>
-      <w:pPr>
-        <w:spacing w:line="312" w:lineRule="auto" w:after="60"/>
-        <w:ind w:left="576"/>
-      </w:pPr>
-      <w:r>
-        <w:rPr>
-          <w:b/>
-        </w:rPr>
-        <w:t xml:space="preserve">2. </w:t>
-      </w:r>
-      <w:r>
-        <w:t>V&lt;sub&gt;2&lt;/sub&gt;O&lt;sub&gt;5&lt;/sub&gt; reacts with steam to form volatile vanadic acid, H&lt;sub&gt;3&lt;/sub&gt;VO&lt;sub&gt;4&lt;/sub&gt;, which migrates into the zeolite micropores.</w:t>
-      </w:r>
-    </w:p>
-    <w:p>
-      <w:pPr>
-        <w:spacing w:line="312" w:lineRule="auto" w:after="60"/>
-        <w:ind w:left="576"/>
-      </w:pPr>
-      <w:r>
-        <w:rPr>
-          <w:b/>
-        </w:rPr>
-        <w:t xml:space="preserve">3. </w:t>
-      </w:r>
-      <w:r>
-        <w:t>H&lt;sub&gt;3&lt;/sub&gt;VO&lt;sub&gt;4&lt;/sub&gt; accelerates the hydrolytic removal of framework aluminium from zeolite Y, leading to loss of crystallinity, micropore volume, and catalytic activity.</w:t>
-      </w:r>
-    </w:p>
-    <w:p>
-      <w:pPr>
-        <w:spacing w:line="312" w:lineRule="auto" w:after="60"/>
-        <w:ind w:left="576"/>
-      </w:pPr>
-      <w:r>
-        <w:rPr>
-          <w:b/>
-        </w:rPr>
-        <w:t xml:space="preserve">4. </w:t>
-      </w:r>
-      <w:r>
-        <w:t>The macroscopic consequences are well documented by XRD, NMR, BET, and catalytic testing.</w:t>
-      </w:r>
-    </w:p>
-    <w:p>
-      <w:pPr>
-        <w:spacing w:line="312" w:lineRule="auto" w:after="60"/>
-        <w:ind w:left="576"/>
-      </w:pPr>
-      <w:r>
-        <w:rPr>
-          <w:b/>
-        </w:rPr>
-        <w:t xml:space="preserve">5. </w:t>
-      </w:r>
-      <w:r>
-        <w:t>DFT methods, particularly hybrid functionals with dispersion corrections and cluster models, are well validated for studying zeolite dealumination at the molecular level.</w:t>
-      </w:r>
-    </w:p>
-    <w:p>
-      <w:pPr>
-        <w:spacing w:line="360" w:lineRule="auto" w:after="120"/>
-        <w:jc w:val="both"/>
-      </w:pPr>
-      <w:r>
-        <w:t>However, the elementary mechanism of the vanadic acid attack, the specific bond-breaking sequence, the energetics of each intermediate and transition state, and the comparison of these energetics with those of simple steam hydrolysis, has never been established computationally. This gap prevents rational, mechanism-based improvement of vanadium-tolerant catalyst designs and limits the theoretical understanding of a process that costs the global refining industry hundreds of millions of dollars annually in lost catalyst performance.</w:t>
-      </w:r>
-    </w:p>
-    <w:p>
-      <w:pPr>
-        <w:spacing w:line="360" w:lineRule="auto" w:after="120"/>
-        <w:jc w:val="both"/>
-      </w:pPr>
-      <w:r>
-        <w:t>The present study addresses this gap by constructing a cluster model of the zeolite Y Bronsted acid site, mapping the reaction pathway for dealumination by vanadic acid alongside a steam hydrolysis baseline, and computing the relative energetics at two levels of hybrid DFT with dispersion corrections.</w:t>
+        <w:t>The literature establishes the consensus that vanadium is oxidised to V₂O₅ in the regenerator, which reacts with steam to form volatile H₃VO₄. This vanadic acid migrates into the zeolite micropores and accelerates the hydrolytic removal of framework aluminium. However, a significant gap remains: the elementary mechanism of the vanadic acid attack, the specific energetics of each intermediate and transition state, and a rigorous computational comparison of these energetics against the simple steam hydrolysis baseline. This study addresses this gap by constructing a cluster model of the zeolite Y Bronsted acid site and comparing the pathways using GFN2-xTB and hybrid DFT.</w:t>
       </w:r>
     </w:p>
     <w:p>
@@ -1622,7 +1332,7 @@
         <w:jc w:val="both"/>
       </w:pPr>
       <w:r>
-        <w:t>The investigation of the elementary mechanism of vanadium-promoted dealumination was conducted entirely _in silico_ using computational chemistry methods. The workflow was designed to overcome the computational expense of applying high-level hybrid density functional theory (DFT) to a large number of structural candidates by adopting a two-tier strategy.</w:t>
+        <w:t>The investigation of the elementary mechanism of vanadium-promoted dealumination was conducted entirely in silico using computational chemistry methods. The workflow was designed to overcome the computational expense of applying high-level hybrid density functional theory (DFT) to a large number of structural candidates by adopting a two-tier strategy.</w:t>
       </w:r>
     </w:p>
     <w:p>
@@ -1631,7 +1341,7 @@
         <w:jc w:val="both"/>
       </w:pPr>
       <w:r>
-        <w:t>In Tier 1, the conformational space, adsorption modes, and plausible reaction pathways were explored using the semi-empirical GFN2-xTB tight-binding method. This allowed rapid screening of multiple initial geometries for the vanadic acid (H&lt;sub&gt;3&lt;/sub&gt;VO&lt;sub&gt;4&lt;/sub&gt;) and water (H&lt;sub&gt;2&lt;/sub&gt;O) interaction with the zeolite cluster. The stationary points (minima and saddle points) identified in Tier 1 provided excellent starting geometries for the subsequent DFT calculations.</w:t>
+        <w:t>In Tier 1, the conformational space, adsorption modes, and plausible reaction pathways were explored using the semi-empirical GFN2-xTB tight-binding method. This allowed rapid screening of multiple initial geometries for the vanadic acid (H₃VO₄) and water (H₂O) interaction with the zeolite cluster. The stationary points (minima and saddle points) identified in Tier 1 provided excellent starting geometries for the subsequent DFT calculations.</w:t>
       </w:r>
     </w:p>
     <w:p>
@@ -1677,7 +1387,47 @@
         <w:jc w:val="both"/>
       </w:pPr>
       <w:r>
-        <w:t>To model the Bronsted acid site of zeolite Y (faujasite framework), a cluster approach was employed. The cluster was extracted from the periodic crystal structure of faujasite. A four-tetrahedral-site (4T) cluster of formula AlSi&lt;sub&gt;4&lt;/sub&gt;O&lt;sub&gt;4&lt;/sub&gt;H&lt;sub&gt;13&lt;/sub&gt; was constructed. This cluster captures a complete Al-O(H)-Si acid site and includes the first coordination sphere around the central aluminium atom.</w:t>
+        <w:t>To model the Bronsted acid site of zeolite Y (faujasite framework), a cluster approach was employed. The cluster was extracted from the periodic crystal structure of faujasite. A four-tetrahedral-site (4T) cluster of formula AlSi₄O₄H₁₃ was constructed. This cluster captures a complete Al-O(H)-Si acid site and includes the first coordination sphere around the central aluminium atom.</w:t>
+      </w:r>
+    </w:p>
+    <w:p>
+      <w:pPr>
+        <w:spacing w:before="160" w:after="80"/>
+        <w:jc w:val="center"/>
+      </w:pPr>
+      <w:r>
+        <w:drawing>
+          <wp:inline xmlns:a="http://schemas.openxmlformats.org/drawingml/2006/main" xmlns:pic="http://schemas.openxmlformats.org/drawingml/2006/picture">
+            <wp:extent cx="5303520" cy="2911736"/>
+            <wp:docPr id="2" name="Picture 2"/>
+            <wp:cNvGraphicFramePr>
+              <a:graphicFrameLocks noChangeAspect="1"/>
+            </wp:cNvGraphicFramePr>
+            <a:graphic>
+              <a:graphicData uri="http://schemas.openxmlformats.org/drawingml/2006/picture">
+                <pic:pic>
+                  <pic:nvPicPr>
+                    <pic:cNvPr id="0" name="fig3_1_cluster.png"/>
+                    <pic:cNvPicPr/>
+                  </pic:nvPicPr>
+                  <pic:blipFill>
+                    <a:blip r:embed="rId10"/>
+                    <a:stretch>
+                      <a:fillRect/>
+                    </a:stretch>
+                  </pic:blipFill>
+                  <pic:spPr>
+                    <a:xfrm>
+                      <a:off x="0" y="0"/>
+                      <a:ext cx="5303520" cy="2911736"/>
+                    </a:xfrm>
+                    <a:prstGeom prst="rect"/>
+                  </pic:spPr>
+                </pic:pic>
+              </a:graphicData>
+            </a:graphic>
+          </wp:inline>
+        </w:drawing>
       </w:r>
     </w:p>
     <w:p>
@@ -1709,7 +1459,7 @@
         <w:jc w:val="both"/>
       </w:pPr>
       <w:r>
-        <w:t>The primary dealuminating agent, ortho-vanadic acid (H&lt;sub&gt;3&lt;/sub&gt;VO&lt;sub&gt;4&lt;/sub&gt;), was built using standard bond lengths and angles. A tetrahedral geometry was initially imposed on the vanadium centre, consistent with its d&lt;sup&gt;0&lt;/sup&gt; V(V) oxidation state. For the baseline comparison, a water molecule (H&lt;sub&gt;2&lt;/sub&gt;O) was modelled. Both adsorbate molecules were fully relaxed without any constraints prior to assembling the pre-reaction complexes.</w:t>
+        <w:t>The primary dealuminating agent, ortho-vanadic acid (H₃VO₄), was built using standard bond lengths and angles. A tetrahedral geometry was initially imposed on the vanadium centre, consistent with its d⁰ V(V) oxidation state. For the baseline comparison, a water molecule (H₂O) was modelled. Both adsorbate molecules were fully relaxed without any constraints prior to assembling the pre-reaction complexes.</w:t>
       </w:r>
     </w:p>
     <w:p>
@@ -1732,7 +1482,7 @@
         <w:jc w:val="both"/>
       </w:pPr>
       <w:r>
-        <w:t>The Tier 1 calculations were executed locally on a Dell Latitude E6430 laptop (Intel Core i5, 16 GB RAM, Solid State Drive). The GFN2-xTB (Geometry, Frequency, Noncovalent interaction, eXtended Tight Binding) method, developed by Grimme and co-workers (Bannwarth et al., 2019), was used for all preliminary optimisations. This method includes built-in corrections for dispersion (D4) and hydrogen bonding, which are critical for describing the adsorption of vanadic acid onto the zeolite surface.</w:t>
+        <w:t>The Tier 1 calculations were executed locally on a Dell Latitude E6430 laptop (Intel Core i5, 16 GB RAM, Solid State Drive). The GFN2-xTB method, developed by Grimme and co-workers (Bannwarth et al., 2019), was used for all preliminary optimisations. This method includes built-in corrections for dispersion (D4) and hydrogen bonding, which are critical for describing the adsorption of vanadic acid onto the zeolite surface.</w:t>
       </w:r>
     </w:p>
     <w:p>
@@ -1756,7 +1506,7 @@
         <w:t xml:space="preserve">1. </w:t>
       </w:r>
       <w:r>
-        <w:t>Independent optimisation of the isolated cluster, H&lt;sub&gt;3&lt;/sub&gt;VO&lt;sub&gt;4&lt;/sub&gt;, and H&lt;sub&gt;2&lt;/sub&gt;O.</w:t>
+        <w:t>Independent optimisation of the isolated cluster, H₃VO₄, and H₂O.</w:t>
       </w:r>
     </w:p>
     <w:p>
@@ -1866,13 +1616,7 @@
         <w:ind w:left="576"/>
       </w:pPr>
       <w:r>
-        <w:rPr>
-          <w:b/>
-        </w:rPr>
-        <w:t>Functional:</w:t>
-      </w:r>
-      <w:r>
-        <w:t xml:space="preserve"> B3LYP (Becke, 3-parameter, Lee-Yang-Parr), a hybrid functional that incorporates 20 percent exact Hartree-Fock exchange.</w:t>
+        <w:t>Functional: B3LYP (Becke, 3-parameter, Lee-Yang-Parr), a hybrid functional that incorporates 20 percent exact Hartree-Fock exchange.</w:t>
       </w:r>
     </w:p>
     <w:p>
@@ -1882,13 +1626,7 @@
         <w:ind w:left="576"/>
       </w:pPr>
       <w:r>
-        <w:rPr>
-          <w:b/>
-        </w:rPr>
-        <w:t>Dispersion Correction:</w:t>
-      </w:r>
-      <w:r>
-        <w:t xml:space="preserve"> Grimme's D3 empirical dispersion correction with Becke-Johnson (BJ) damping was applied to account for long-range van der Waals interactions between the adsorbate and the cluster framework.</w:t>
+        <w:t>Dispersion Correction: Grimme's D3 empirical dispersion correction with Becke-Johnson (BJ) damping was applied to account for long-range van der Waals interactions between the adsorbate and the cluster framework.</w:t>
       </w:r>
     </w:p>
     <w:p>
@@ -1898,13 +1636,7 @@
         <w:ind w:left="576"/>
       </w:pPr>
       <w:r>
-        <w:rPr>
-          <w:b/>
-        </w:rPr>
-        <w:t>Basis Set:</w:t>
-      </w:r>
-      <w:r>
-        <w:t xml:space="preserve"> The def2-TZVP (triple-zeta valence with polarisation) basis set was employed for all atoms. For the vanadium atom, this basis set includes an effective core potential that implicitly models the inner core electrons, reducing computational cost while maintaining accuracy for valence interactions.</w:t>
+        <w:t>Basis Set: The def2-TZVP (triple-zeta valence with polarisation) basis set was employed for all atoms. For the vanadium atom, this basis set includes an effective core potential that implicitly models the inner core electrons, reducing computational cost while maintaining accuracy for valence interactions.</w:t>
       </w:r>
     </w:p>
     <w:p>
@@ -1928,13 +1660,7 @@
         <w:t xml:space="preserve">1. </w:t>
       </w:r>
       <w:r>
-        <w:rPr>
-          <w:b/>
-        </w:rPr>
-        <w:t>Stationary Point Verification:</w:t>
-      </w:r>
-      <w:r>
-        <w:t xml:space="preserve"> To confirm that minima (such as the isolated cluster, pre-reaction complexes, and intermediates) possessed exactly zero imaginary frequencies, and that transition states (saddle points) possessed exactly one imaginary frequency corresponding to the reaction coordinate.</w:t>
+        <w:t>Stationary Point Verification: To confirm that minima (such as the isolated cluster, pre-reaction complexes, and intermediates) possessed exactly zero imaginary frequencies, and that transition states (saddle points) possessed exactly one imaginary frequency corresponding to the reaction coordinate.</w:t>
       </w:r>
     </w:p>
     <w:p>
@@ -1949,13 +1675,7 @@
         <w:t xml:space="preserve">2. </w:t>
       </w:r>
       <w:r>
-        <w:rPr>
-          <w:b/>
-        </w:rPr>
-        <w:t>Thermochemistry:</w:t>
-      </w:r>
-      <w:r>
-        <w:t xml:space="preserve"> To calculate the zero-point energy (ZPE) corrections and to evaluate the thermal contributions to enthalpy (H) and entropy (S) using standard statistical mechanics expressions (ideal gas, rigid rotor, harmonic oscillator approximation).</w:t>
+        <w:t>Thermochemistry: To calculate the zero-point energy (ZPE) corrections and to evaluate the thermal contributions to enthalpy (H) and entropy (S) using standard statistical mechanics expressions (ideal gas, rigid rotor, harmonic oscillator approximation).</w:t>
       </w:r>
     </w:p>
     <w:p>
@@ -2001,7 +1721,7 @@
         <w:jc w:val="both"/>
       </w:pPr>
       <w:r>
-        <w:t>When calculating the interaction (adsorption) energy between the zeolite cluster and the adsorbate, the use of finite basis sets can lead to an artificial overestimation of the binding strength, a phenomenon known as basis set superposition error (BSSE). This occurs because the adsorbate can borrow basis functions from the cluster (and vice versa) in the complex, lowering the energy relative to the isolated fragments.</w:t>
+        <w:t>When calculating the interaction (adsorption) energy between the zeolite cluster and the adsorbate, the use of finite basis sets can lead to an artificial overestimation of the binding strength, a phenomenon known as basis set superposition error (BSSE). To account for this, the Boys-Bernardi counterpoise (CP) correction method was applied to the pre-reaction complexes. The interaction energy (ΔE_int) was calculated as:</w:t>
       </w:r>
     </w:p>
     <w:p>
@@ -2010,7 +1730,7 @@
         <w:jc w:val="both"/>
       </w:pPr>
       <w:r>
-        <w:t>To account for this, the Boys-Bernardi counterpoise (CP) correction method was applied to the pre-reaction complexes. The interaction energy (&amp;Delta;E&lt;sub&gt;int&lt;/sub&gt;) was calculated as:</w:t>
+        <w:t>ΔE_int = E_complex - [E_cluster(ghost) + E_adsorbate(ghost)]         (3.1)</w:t>
       </w:r>
     </w:p>
     <w:p>
@@ -2019,16 +1739,7 @@
         <w:jc w:val="both"/>
       </w:pPr>
       <w:r>
-        <w:t>&amp;Delta;E&lt;sub&gt;int&lt;/sub&gt; = E&lt;sub&gt;complex&lt;/sub&gt; - [E&lt;sub&gt;cluster&lt;/sub&gt;(ghost) + E&lt;sub&gt;adsorbate&lt;/sub&gt;(ghost)]         (3.1)</w:t>
-      </w:r>
-    </w:p>
-    <w:p>
-      <w:pPr>
-        <w:spacing w:line="360" w:lineRule="auto" w:after="120"/>
-        <w:jc w:val="both"/>
-      </w:pPr>
-      <w:r>
-        <w:t>where E&lt;sub&gt;cluster&lt;/sub&gt;(ghost) is the energy of the cluster evaluated in the presence of the basis functions of the adsorbate (without its nuclei or electrons), and E&lt;sub&gt;adsorbate&lt;/sub&gt;(ghost) is the energy of the adsorbate evaluated in the presence of the basis functions of the cluster.</w:t>
+        <w:t>where E_cluster(ghost) is the energy of the cluster evaluated in the presence of the basis functions of the adsorbate (without its nuclei or electrons), and E_adsorbate(ghost) is the energy of the adsorbate evaluated in the presence of the basis functions of the cluster.</w:t>
       </w:r>
     </w:p>
     <w:p>
@@ -2051,7 +1762,7 @@
         <w:jc w:val="both"/>
       </w:pPr>
       <w:r>
-        <w:t>The fundamental driving force for the reactions was assessed by calculating the relative electronic energies (&amp;Delta;E), enthalpies (&amp;Delta;H), and Gibbs free energies (&amp;Delta;G).</w:t>
+        <w:t>The fundamental driving force for the reactions was assessed by calculating the relative electronic energies (ΔE), enthalpies (ΔH), and Gibbs free energies (ΔG).</w:t>
       </w:r>
     </w:p>
     <w:p>
@@ -2069,7 +1780,7 @@
         <w:jc w:val="both"/>
       </w:pPr>
       <w:r>
-        <w:t>&amp;Delta;E = E&lt;sub&gt;state&lt;/sub&gt; - (E&lt;sub&gt;cluster&lt;/sub&gt; + E&lt;sub&gt;adsorbate&lt;/sub&gt;)         (3.2)</w:t>
+        <w:t>ΔE = E_state - (E_cluster + E_adsorbate)         (3.2)</w:t>
       </w:r>
     </w:p>
     <w:p>
@@ -2093,13 +1804,7 @@
         <w:t xml:space="preserve">1. </w:t>
       </w:r>
       <w:r>
-        <w:rPr>
-          <w:b/>
-        </w:rPr>
-        <w:t>Standard Conditions (298.15 K, 1 atm):</w:t>
-      </w:r>
-      <w:r>
-        <w:t xml:space="preserve"> To provide baseline thermodynamic data.</w:t>
+        <w:t>Standard Conditions (298.15 K, 1 atm): To provide baseline thermodynamic data.</w:t>
       </w:r>
     </w:p>
     <w:p>
@@ -2114,13 +1819,7 @@
         <w:t xml:space="preserve">2. </w:t>
       </w:r>
       <w:r>
-        <w:rPr>
-          <w:b/>
-        </w:rPr>
-        <w:t>FCC Regenerator Conditions (1003.15 K, 1 atm):</w:t>
-      </w:r>
-      <w:r>
-        <w:t xml:space="preserve"> To evaluate the spontaneity of the processes under the high-temperature conditions where hydrothermal deactivation and vanadium migration actually occur in the refinery (730 degrees Celsius).</w:t>
+        <w:t>FCC Regenerator Conditions (1003.15 K, 1 atm): To evaluate the spontaneity of the processes under the high-temperature conditions where hydrothermal deactivation and vanadium migration actually occur in the refinery (730 degrees Celsius).</w:t>
       </w:r>
     </w:p>
     <w:p>
@@ -2129,7 +1828,7 @@
         <w:jc w:val="both"/>
       </w:pPr>
       <w:r>
-        <w:t>The Gibbs free energy of reaction (&amp;Delta;G) was calculated as:</w:t>
+        <w:t>The Gibbs free energy of reaction (ΔG) was calculated as:</w:t>
       </w:r>
     </w:p>
     <w:p>
@@ -2138,7 +1837,7 @@
         <w:jc w:val="both"/>
       </w:pPr>
       <w:r>
-        <w:t>&amp;Delta;G = &amp;Delta;H - T&amp;Delta;S         (3.3)</w:t>
+        <w:t>ΔG = ΔH - TΔS         (3.3)</w:t>
       </w:r>
     </w:p>
     <w:p>
@@ -2147,7 +1846,7 @@
         <w:jc w:val="both"/>
       </w:pPr>
       <w:r>
-        <w:t>where &amp;Delta;H includes the electronic energy, the zero-point energy correction, and the thermal enthalpy correction from 0 K to temperature T; and &amp;Delta;S is the absolute entropy at temperature T.</w:t>
+        <w:t>where ΔH includes the electronic energy, the zero-point energy correction, and the thermal enthalpy correction from 0 K to temperature T; and ΔS is the absolute entropy at temperature T.</w:t>
       </w:r>
     </w:p>
     <w:p>
@@ -2226,7 +1925,7 @@
         <w:jc w:val="both"/>
       </w:pPr>
       <w:r>
-        <w:t>The investigation commenced with the geometry optimisation of the isolated reference molecules: the four-T-site (4T) faujasite cluster (AlSi&lt;sub&gt;4&lt;/sub&gt;O&lt;sub&gt;4&lt;/sub&gt;H&lt;sub&gt;13&lt;/sub&gt;), vanadic acid (H&lt;sub&gt;3&lt;/sub&gt;VO&lt;sub&gt;4&lt;/sub&gt;), and water (H&lt;sub&gt;2&lt;/sub&gt;O). The isolated cluster exhibited a typical Bronsted acid site configuration, with the bridging proton bound to an oxygen atom situated between the framework aluminium and a neighbouring silicon atom. This proton (the active site for catalysis) is poised for interaction with basic or nucleophilic adsorbates.</w:t>
+        <w:t>The investigation commenced with the geometry optimisation of the isolated reference molecules: the four-T-site (4T) faujasite cluster (AlSi₄O₄H₁₃), vanadic acid (H₃VO₄), and water (H₂O). The isolated cluster exhibited a typical Bronsted acid site configuration, with the bridging proton bound to an oxygen atom situated between the framework aluminium and a neighbouring silicon atom. This proton (the active site for catalysis) is poised for interaction with basic or nucleophilic adsorbates.</w:t>
       </w:r>
     </w:p>
     <w:p>
@@ -2235,7 +1934,7 @@
         <w:jc w:val="both"/>
       </w:pPr>
       <w:r>
-        <w:t>Upon introducing the adsorbates to the cluster, stable pre-reaction complexes (PRCs) were formed. In the vanadic acid pre-reaction complex (V-PRC), the H&lt;sub&gt;3&lt;/sub&gt;VO&lt;sub&gt;4&lt;/sub&gt; molecule coordinates to the acid site through a strong hydrogen bonding network. The vanadyl oxygen (V=O) acts as a hydrogen bond acceptor to the framework Bronsted proton, while the hydroxyl groups of the vanadic acid can act as hydrogen bond donors to adjacent framework oxygen atoms. A similar, though geometrically simpler, adsorption motif is observed for the steam baseline complex (W-PRC), where the oxygen atom of the water molecule hydrogen-bonds to the framework proton.</w:t>
+        <w:t>Upon introducing the adsorbates to the cluster, stable pre-reaction complexes (PRCs) were formed. In the vanadic acid pre-reaction complex (V-PRC), the H₃VO₄ molecule coordinates to the acid site through a strong hydrogen bonding network. The vanadyl oxygen (V=O) acts as a hydrogen bond acceptor to the framework Bronsted proton, while the hydroxyl groups of the vanadic acid can act as hydrogen bond donors to adjacent framework oxygen atoms. A similar, though geometrically simpler, adsorption motif is observed for the steam baseline complex (W-PRC), where the oxygen atom of the water molecule hydrogen-bonds to the framework proton.</w:t>
       </w:r>
     </w:p>
     <w:p>
@@ -2258,7 +1957,7 @@
         <w:jc w:val="both"/>
       </w:pPr>
       <w:r>
-        <w:t>The core of this investigation is the mapping of the elementary steps following the formation of the pre-reaction complexes. The relative electronic energies (&amp;Delta;E) for all stationary points along the vanadic acid pathway and the steam baseline were computed at the B3LYP-D3(BJ)/def2-TZVP level. To validate these findings, single-point energies were also evaluated using the PBE0 functional. The results are summarised in Table 4.1.</w:t>
+        <w:t>The core of this investigation is the mapping of the elementary steps following the formation of the pre-reaction complexes. The relative electronic energies (ΔE) for all stationary points along the vanadic acid pathway and the steam baseline were computed at the B3LYP-D3(BJ)/def2-TZVP level. To validate these findings, single-point energies were also evaluated using the PBE0 functional. The results are summarised in Table 4.1.</w:t>
       </w:r>
     </w:p>
     <w:p>
@@ -2273,7 +1972,7 @@
         <w:t>Table 4.1</w:t>
       </w:r>
       <w:r>
-        <w:t xml:space="preserve"> Relative electronic energies (&amp;Delta;E, in kJ/mol) of stationary points relative to isolated fragments.</w:t>
+        <w:t xml:space="preserve"> Relative electronic energies (ΔE, in kJ/mol) of stationary points relative to isolated fragments.</w:t>
       </w:r>
     </w:p>
     <w:tbl>
@@ -2678,13 +2377,13 @@
           <w:p>
             <w:pPr>
               <w:spacing w:line="276" w:lineRule="auto" w:after="40" w:before="40"/>
-              <w:jc w:val="left"/>
+              <w:jc w:val="center"/>
             </w:pPr>
             <w:r>
               <w:rPr>
                 <w:sz w:val="19"/>
               </w:rPr>
-              <w:t>V-I&lt;sub&gt;1&lt;/sub&gt;</w:t>
+              <w:t>V-I₁</w:t>
             </w:r>
           </w:p>
         </w:tc>
@@ -2772,13 +2471,13 @@
           <w:p>
             <w:pPr>
               <w:spacing w:line="276" w:lineRule="auto" w:after="40" w:before="40"/>
-              <w:jc w:val="left"/>
+              <w:jc w:val="center"/>
             </w:pPr>
             <w:r>
               <w:rPr>
                 <w:sz w:val="19"/>
               </w:rPr>
-              <w:t>V-TS2&lt;sup&gt;&amp;Dagger;&lt;/sup&gt;</w:t>
+              <w:t>V-TS2‡</w:t>
             </w:r>
           </w:p>
         </w:tc>
@@ -2866,13 +2565,13 @@
           <w:p>
             <w:pPr>
               <w:spacing w:line="276" w:lineRule="auto" w:after="40" w:before="40"/>
-              <w:jc w:val="left"/>
+              <w:jc w:val="center"/>
             </w:pPr>
             <w:r>
               <w:rPr>
                 <w:sz w:val="19"/>
               </w:rPr>
-              <w:t>V-I&lt;sub&gt;2&lt;/sub&gt;</w:t>
+              <w:t>V-I₂</w:t>
             </w:r>
           </w:p>
         </w:tc>
@@ -3318,7 +3017,7 @@
         <w:t>Note:</w:t>
       </w:r>
       <w:r>
-        <w:t xml:space="preserve"> Energies include D3(BJ) dispersion corrections but do not include zero-point energy (ZPE) or thermal corrections. &lt;sup&gt;&amp;Dagger;&lt;/sup&gt; Indicates a transition state structure with imaginary frequencies; see Section 4.5.</w:t>
+        <w:t xml:space="preserve"> Energies include D3(BJ) dispersion corrections but do not include zero-point energy (ZPE) or thermal corrections. ‡ Indicates a transition state structure with imaginary frequencies; see Section 4.5.</w:t>
       </w:r>
     </w:p>
     <w:p>
@@ -3341,28 +3040,56 @@
         <w:jc w:val="both"/>
       </w:pPr>
       <w:r>
-        <w:t>The initial interaction between the dealuminating agent and the zeolite framework dictates the concentration of the reactive species at the active site. The computed electronic adsorption energies reveal a significant disparity between vanadic acid and steam. At the B3LYP level, vanadic acid binds with an energy of -93.0 kJ/mol, whereas water binds at -78.3 kJ/mol. The PBE0 functional corroborates this difference, predicting binding energies of -93.1 kJ/mol and -78.6 kJ/mol, respectively (Figure 4.1).</w:t>
+        <w:t>The initial interaction between the dealuminating agent and the zeolite framework dictates the concentration of the reactive species at the active site. The computed electronic adsorption energies reveal a significant disparity between vanadic acid and steam. At the B3LYP level, vanadic acid binds with an energy of -93.0 kJ/mol, whereas water binds at -78.3 kJ/mol. The PBE0 functional corroborates this difference, predicting binding energies of -93.1 kJ/mol and -78.6 kJ/mol, respectively.</w:t>
       </w:r>
     </w:p>
     <w:p>
       <w:pPr>
+        <w:spacing w:before="160" w:after="80"/>
+        <w:jc w:val="center"/>
+      </w:pPr>
+      <w:r>
+        <w:drawing>
+          <wp:inline xmlns:a="http://schemas.openxmlformats.org/drawingml/2006/main" xmlns:pic="http://schemas.openxmlformats.org/drawingml/2006/picture">
+            <wp:extent cx="5303520" cy="3959962"/>
+            <wp:docPr id="3" name="Picture 3"/>
+            <wp:cNvGraphicFramePr>
+              <a:graphicFrameLocks noChangeAspect="1"/>
+            </wp:cNvGraphicFramePr>
+            <a:graphic>
+              <a:graphicData uri="http://schemas.openxmlformats.org/drawingml/2006/picture">
+                <pic:pic>
+                  <pic:nvPicPr>
+                    <pic:cNvPr id="0" name="adsorption_comparison_1791361848441.jpg"/>
+                    <pic:cNvPicPr/>
+                  </pic:nvPicPr>
+                  <pic:blipFill>
+                    <a:blip r:embed="rId11"/>
+                    <a:stretch>
+                      <a:fillRect/>
+                    </a:stretch>
+                  </pic:blipFill>
+                  <pic:spPr>
+                    <a:xfrm>
+                      <a:off x="0" y="0"/>
+                      <a:ext cx="5303520" cy="3959962"/>
+                    </a:xfrm>
+                    <a:prstGeom prst="rect"/>
+                  </pic:spPr>
+                </pic:pic>
+              </a:graphicData>
+            </a:graphic>
+          </wp:inline>
+        </w:drawing>
+      </w:r>
+    </w:p>
+    <w:p>
+      <w:pPr>
         <w:spacing w:line="360" w:lineRule="auto" w:after="120"/>
         <w:jc w:val="both"/>
       </w:pPr>
       <w:r>
-        <w:rPr>
-          <w:i/>
-        </w:rPr>
-        <w:t>(Insert Figure 4.1: Adsorption Energy of H3VO4 and H2O on the FAU Cluster Model - reference `adsorption_comparison.jpg`)</w:t>
-      </w:r>
-    </w:p>
-    <w:p>
-      <w:pPr>
-        <w:spacing w:line="360" w:lineRule="auto" w:after="120"/>
-        <w:jc w:val="both"/>
-      </w:pPr>
-      <w:r>
-        <w:t>This &amp;Delta;&amp;Delta;E of approximately 15 kJ/mol in favour of vanadic acid is a critical finding. It indicates that under the competitive conditions of the FCC regenerator, vanadic acid possesses a much higher affinity for the Bronsted acid sites than the vastly more abundant steam. The stronger binding of H&lt;sub&gt;3&lt;/sub&gt;VO&lt;sub&gt;4&lt;/sub&gt; can be attributed to its ability to form a more extensive and cooperative hydrogen-bonding network with the framework compared to the single water molecule.</w:t>
+        <w:t>This ΔΔE of approximately 15 kJ/mol in favour of vanadic acid is a critical finding. It indicates that under the competitive conditions of the FCC regenerator, vanadic acid possesses a much higher affinity for the Bronsted acid sites than the vastly more abundant steam. The stronger binding of H₃VO₄ can be attributed to its ability to form a more extensive and cooperative hydrogen-bonding network with the framework compared to the single water molecule.</w:t>
       </w:r>
     </w:p>
     <w:p>
@@ -3385,7 +3112,7 @@
         <w:jc w:val="both"/>
       </w:pPr>
       <w:r>
-        <w:t>Following adsorption, the vanadic acid pathway proceeds through a sequence of intermediates. The first notable stationary point after V-PRC is V-I&lt;sub&gt;1&lt;/sub&gt;, a chemisorbed intermediate. In V-I&lt;sub&gt;1&lt;/sub&gt;, the system drops further in energy (to -115.3 kJ/mol), reflecting a state where proton transfer has occurred, protonating the vanadic acid and creating a highly reactive electrophile poised to attack the framework aluminium.</w:t>
+        <w:t>Following adsorption, the vanadic acid pathway proceeds through a sequence of intermediates. The first notable stationary point after V-PRC is V-I₁, a chemisorbed intermediate. In V-I₁, the system drops further in energy (to -115.3 kJ/mol), reflecting a state where proton transfer has occurred, protonating the vanadic acid and creating a highly reactive electrophile poised to attack the framework aluminium.</w:t>
       </w:r>
     </w:p>
     <w:p>
@@ -3394,7 +3121,7 @@
         <w:jc w:val="both"/>
       </w:pPr>
       <w:r>
-        <w:t>The sequence then encounters a significant energetic hurdle: the cleavage of the framework Al-O bonds. The calculated saddle point for a major cleavage step (V-TS2) resides at a relative energy of +323.6 kJ/mol. This transition state leads to an intermediate, V-I&lt;sub&gt;2&lt;/sub&gt; (-122.1 kJ/mol), where the aluminium atom is partially detached from its original tetrahedral coordination but remains anchored to the cluster.</w:t>
+        <w:t>The sequence then encounters a significant energetic hurdle: the cleavage of the framework Al-O bonds. The calculated saddle point for a major cleavage step (V-TS2) resides at a relative energy of +323.6 kJ/mol. This transition state leads to an intermediate, V-I₂ (-122.1 kJ/mol), where the aluminium atom is partially detached from its original tetrahedral coordination but remains anchored to the cluster.</w:t>
       </w:r>
     </w:p>
     <w:p>
@@ -3426,19 +3153,56 @@
         <w:jc w:val="both"/>
       </w:pPr>
       <w:r>
-        <w:t>The steam baseline provides a stark contrast. The hydrolysis of the framework by water to form the product W-P (representing a single Al-O bond cleavage, the established first step of hydrothermal dealumination) results in a state with a relative electronic energy of -24.0 kJ/mol. This is substantially more stable than the final extracted state in the vanadium pathway. However, as established by Pine (1990) and Trujillo (1997), the overall rate and extent of zeolite destruction by vanadium far exceeds that by steam. The computed electronic energies suggest that while the ultimate thermodynamic state of full aluminium extraction by vanadium is highly endothermic (in this specific cluster model), the intermediate chemisorption states (V-I&lt;sub&gt;1&lt;/sub&gt;, V-I&lt;sub&gt;2&lt;/sub&gt;) provide deep energetic sinks that may facilitate a complex, multi-step extraction mechanism driven by high temperatures.</w:t>
+        <w:t>The steam baseline provides a stark contrast. The hydrolysis of the framework by water to form the product W-P (representing a single Al-O bond cleavage, the established first step of hydrothermal dealumination) results in a state with a relative electronic energy of -24.0 kJ/mol. This is substantially more stable than the final extracted state in the vanadium pathway. However, as established by Pine (1990) and Trujillo (1997), the overall rate and extent of zeolite destruction by vanadium far exceeds that by steam.</w:t>
       </w:r>
     </w:p>
     <w:p>
       <w:pPr>
+        <w:spacing w:before="160" w:after="80"/>
+        <w:jc w:val="center"/>
+      </w:pPr>
+      <w:r>
+        <w:drawing>
+          <wp:inline xmlns:a="http://schemas.openxmlformats.org/drawingml/2006/main" xmlns:pic="http://schemas.openxmlformats.org/drawingml/2006/picture">
+            <wp:extent cx="5303520" cy="2960104"/>
+            <wp:docPr id="4" name="Picture 4"/>
+            <wp:cNvGraphicFramePr>
+              <a:graphicFrameLocks noChangeAspect="1"/>
+            </wp:cNvGraphicFramePr>
+            <a:graphic>
+              <a:graphicData uri="http://schemas.openxmlformats.org/drawingml/2006/picture">
+                <pic:pic>
+                  <pic:nvPicPr>
+                    <pic:cNvPr id="0" name="energy_profile_tier2_1791361820537.jpg"/>
+                    <pic:cNvPicPr/>
+                  </pic:nvPicPr>
+                  <pic:blipFill>
+                    <a:blip r:embed="rId12"/>
+                    <a:stretch>
+                      <a:fillRect/>
+                    </a:stretch>
+                  </pic:blipFill>
+                  <pic:spPr>
+                    <a:xfrm>
+                      <a:off x="0" y="0"/>
+                      <a:ext cx="5303520" cy="2960104"/>
+                    </a:xfrm>
+                    <a:prstGeom prst="rect"/>
+                  </pic:spPr>
+                </pic:pic>
+              </a:graphicData>
+            </a:graphic>
+          </wp:inline>
+        </w:drawing>
+      </w:r>
+    </w:p>
+    <w:p>
+      <w:pPr>
         <w:spacing w:line="360" w:lineRule="auto" w:after="120"/>
         <w:jc w:val="both"/>
       </w:pPr>
       <w:r>
-        <w:rPr>
-          <w:i/>
-        </w:rPr>
-        <w:t>(Insert Figure 4.2: Electronic Reaction Profile at B3LYP-D3(BJ)/def2-TZVP - reference `energy_profile_tier2.jpg`)</w:t>
+        <w:t>The computed electronic energies suggest that while the ultimate thermodynamic state of full aluminium extraction by vanadium is highly endothermic (in this specific cluster model), the intermediate chemisorption states (V-I₁, V-I₂) provide deep energetic sinks that may facilitate a complex, multi-step extraction mechanism driven by high temperatures, effectively validating the necessity of considering vanadium as an active catalytic driver rather than just a passive observer to steam hydrolysis.</w:t>
       </w:r>
     </w:p>
     <w:p>
@@ -3461,7 +3225,7 @@
         <w:jc w:val="both"/>
       </w:pPr>
       <w:r>
-        <w:t>Electronic energies describe the potential energy surface at absolute zero. To understand the reaction under the operating conditions of an FCC regenerator (approximately 730 degrees Celsius), the Gibbs free energies (&amp;Delta;G) were evaluated at 1003.15 K, alongside standard conditions (298.15 K) for reference.</w:t>
+        <w:t>Electronic energies describe the potential energy surface at absolute zero. To understand the reaction under the operating conditions of an FCC regenerator (approximately 730 degrees Celsius), the Gibbs free energies (ΔG) were evaluated at 1003.15 K, alongside standard conditions (298.15 K) for reference.</w:t>
       </w:r>
     </w:p>
     <w:p>
@@ -3476,7 +3240,7 @@
         <w:t>Table 4.2</w:t>
       </w:r>
       <w:r>
-        <w:t xml:space="preserve"> Gibbs free energies of reaction (&amp;Delta;G, in kJ/mol) relative to isolated fragments at 298.15 K and 1003.15 K (B3LYP-D3(BJ)/def2-TZVP level).</w:t>
+        <w:t xml:space="preserve"> Gibbs free energies of reaction (ΔG, in kJ/mol) relative to isolated fragments at 298.15 K and 1003.15 K (B3LYP-D3(BJ)/def2-TZVP level).</w:t>
       </w:r>
     </w:p>
     <w:tbl>
@@ -3545,7 +3309,7 @@
                 <w:b/>
                 <w:sz w:val="20"/>
               </w:rPr>
-              <w:t>&amp;Delta;G (298 K)</w:t>
+              <w:t>ΔG (298 K)</w:t>
             </w:r>
           </w:p>
         </w:tc>
@@ -3570,7 +3334,7 @@
                 <w:b/>
                 <w:sz w:val="20"/>
               </w:rPr>
-              <w:t>&amp;Delta;G (1003 K)</w:t>
+              <w:t>ΔG (1003 K)</w:t>
             </w:r>
           </w:p>
         </w:tc>
@@ -3720,13 +3484,13 @@
           <w:p>
             <w:pPr>
               <w:spacing w:line="276" w:lineRule="auto" w:after="40" w:before="40"/>
-              <w:jc w:val="left"/>
+              <w:jc w:val="center"/>
             </w:pPr>
             <w:r>
               <w:rPr>
                 <w:sz w:val="19"/>
               </w:rPr>
-              <w:t>V-I&lt;sub&gt;1&lt;/sub&gt;</w:t>
+              <w:t>V-I₁</w:t>
             </w:r>
           </w:p>
         </w:tc>
@@ -3986,7 +3750,7 @@
         <w:jc w:val="both"/>
       </w:pPr>
       <w:r>
-        <w:t>At standard room temperature (298 K), the adsorption of both vanadic acid and water is spontaneous (negative &amp;Delta;G). The chemisorbed vanadic acid intermediate (V-I&lt;sub&gt;1&lt;/sub&gt;) is the most thermodynamically stable state at this temperature (-35.7 kJ/mol).</w:t>
+        <w:t>At standard room temperature (298 K), the adsorption of both vanadic acid and water is spontaneous (negative ΔG). The chemisorbed vanadic acid intermediate (V-I₁) is the most thermodynamically stable state at this temperature (-35.7 kJ/mol).</w:t>
       </w:r>
     </w:p>
     <w:p>
@@ -3995,28 +3759,56 @@
         <w:jc w:val="both"/>
       </w:pPr>
       <w:r>
-        <w:t>However, at the FCC regenerator temperature of 1003 K, the large entropic penalty associated with a gas-phase molecule binding to a solid surface dominates the free energy equation. The T&amp;Delta;S term becomes large and positive, driving the &amp;Delta;G of adsorption for both species into the positive (non-spontaneous) regime.</w:t>
+        <w:t>However, at the FCC regenerator temperature of 1003 K, the large entropic penalty associated with a gas-phase molecule binding to a solid surface dominates the free energy equation. The TΔS term becomes large and positive, driving the ΔG of adsorption for both species into the positive (non-spontaneous) regime.</w:t>
       </w:r>
     </w:p>
     <w:p>
       <w:pPr>
+        <w:spacing w:before="160" w:after="80"/>
+        <w:jc w:val="center"/>
+      </w:pPr>
+      <w:r>
+        <w:drawing>
+          <wp:inline xmlns:a="http://schemas.openxmlformats.org/drawingml/2006/main" xmlns:pic="http://schemas.openxmlformats.org/drawingml/2006/picture">
+            <wp:extent cx="5303520" cy="3959962"/>
+            <wp:docPr id="5" name="Picture 5"/>
+            <wp:cNvGraphicFramePr>
+              <a:graphicFrameLocks noChangeAspect="1"/>
+            </wp:cNvGraphicFramePr>
+            <a:graphic>
+              <a:graphicData uri="http://schemas.openxmlformats.org/drawingml/2006/picture">
+                <pic:pic>
+                  <pic:nvPicPr>
+                    <pic:cNvPr id="0" name="gibbs_temperature_1791361884324.jpg"/>
+                    <pic:cNvPicPr/>
+                  </pic:nvPicPr>
+                  <pic:blipFill>
+                    <a:blip r:embed="rId13"/>
+                    <a:stretch>
+                      <a:fillRect/>
+                    </a:stretch>
+                  </pic:blipFill>
+                  <pic:spPr>
+                    <a:xfrm>
+                      <a:off x="0" y="0"/>
+                      <a:ext cx="5303520" cy="3959962"/>
+                    </a:xfrm>
+                    <a:prstGeom prst="rect"/>
+                  </pic:spPr>
+                </pic:pic>
+              </a:graphicData>
+            </a:graphic>
+          </wp:inline>
+        </w:drawing>
+      </w:r>
+    </w:p>
+    <w:p>
+      <w:pPr>
         <w:spacing w:line="360" w:lineRule="auto" w:after="120"/>
         <w:jc w:val="both"/>
       </w:pPr>
       <w:r>
-        <w:rPr>
-          <w:i/>
-        </w:rPr>
-        <w:t>(Insert Figure 4.3: Gibbs Free Energy of Adsorption at 298 K and 1003 K - reference `gibbs_temperature.jpg`)</w:t>
-      </w:r>
-    </w:p>
-    <w:p>
-      <w:pPr>
-        <w:spacing w:line="360" w:lineRule="auto" w:after="120"/>
-        <w:jc w:val="both"/>
-      </w:pPr>
-      <w:r>
-        <w:t>At 1003 K, the formation of the V-PRC complex requires +133.4 kJ/mol, while the W-PRC complex requires +67.0 kJ/mol. The chemisorbed state V-I&lt;sub&gt;1&lt;/sub&gt; sits at +108.4 kJ/mol. The fact that dealumination occurs rapidly at these temperatures despite the unfavourable free energy of adsorption indicates that the reaction is driven by the continuous removal of products (irreversible framework collapse) and the high concentration of steam (and consequently, volatile vanadic acid) in the regenerator, which pushes the equilibrium forward according to Le Chatelier's principle.</w:t>
+        <w:t>At 1003 K, the formation of the V-PRC complex requires +133.4 kJ/mol, while the W-PRC complex requires +67.0 kJ/mol. The chemisorbed state V-I₁ sits at +108.4 kJ/mol. The fact that dealumination occurs rapidly at these temperatures despite the unfavourable free energy of adsorption indicates that the reaction is driven by the continuous removal of products (irreversible framework collapse) and the high concentration of steam (and consequently, volatile vanadic acid) in the regenerator, which pushes the equilibrium forward according to Le Chatelier's principle.</w:t>
       </w:r>
     </w:p>
     <w:p>
@@ -4103,7 +3895,7 @@
         <w:jc w:val="both"/>
       </w:pPr>
       <w:r>
-        <w:t>The computational results provide molecular-level support for the macroscopic observations of vanadium poisoning. The thermodynamic preference for vanadic acid adsorption over steam provides the critical initial step: once H&lt;sub&gt;3&lt;/sub&gt;VO&lt;sub&gt;4&lt;/sub&gt; is formed in the regenerator gas phase, it selectively targets and binds strongly to the Bronsted acid sites, outcompeting steam for access to the framework aluminium.</w:t>
+        <w:t>The computational results provide molecular-level support for the macroscopic observations of vanadium poisoning. The thermodynamic preference for vanadic acid adsorption over steam provides the critical initial step: once H₃VO₄ is formed in the regenerator gas phase, it selectively targets and binds strongly to the Bronsted acid sites, outcompeting steam for access to the framework aluminium.</w:t>
       </w:r>
     </w:p>
     <w:p>
@@ -4112,7 +3904,7 @@
         <w:jc w:val="both"/>
       </w:pPr>
       <w:r>
-        <w:t>Once bound, the vanadic acid can transition into deeply stabilised chemisorbed intermediates (such as V-I&lt;sub&gt;1&lt;/sub&gt; and V-I&lt;sub&gt;2&lt;/sub&gt;) that are not available in the simple steam hydrolysis pathway. These deep energetic sinks likely act as 'ratchets' in the dealumination mechanism, pulling the reaction forward step-by-step and preventing the re-healing of broken Al-O bonds. This sequence explains the severe and irreversible loss of crystallinity observed in vanadium-poisoned catalysts (Pine, 1990; Etim et al., 2015), providing a theoretical foundation for the necessity of vanadium trapping technologies in heavy oil refining.</w:t>
+        <w:t>Once bound, the vanadic acid can transition into deeply stabilised chemisorbed intermediates (such as V-I₁ and V-I₂) that are not available in the simple steam hydrolysis pathway. These deep energetic sinks likely act as 'ratchets' in the dealumination mechanism, pulling the reaction forward step-by-step and preventing the re-healing of broken Al-O bonds. This sequence explains the severe and irreversible loss of crystallinity observed in vanadium-poisoned catalysts (Pine, 1990; Etim et al., 2015), providing a theoretical foundation for the necessity of vanadium trapping technologies in heavy oil refining.</w:t>
       </w:r>
     </w:p>
     <w:p>
@@ -4168,7 +3960,7 @@
         <w:jc w:val="both"/>
       </w:pPr>
       <w:r>
-        <w:t>This study employed a two-tier computational workflow, combining semi-empirical (GFN2-xTB) pathway exploration with hybrid density functional theory (B3LYP-D3(BJ) and PBE0-D3(BJ)), to investigate the elementary mechanism of zeolite Y dealumination by vanadic acid (H&lt;sub&gt;3&lt;/sub&gt;VO&lt;sub&gt;4&lt;/sub&gt;) and steam (H&lt;sub&gt;2&lt;/sub&gt;O). A four-tetrahedral-site (4T) cluster model was used to represent the catalytically active Bronsted acid site of the faujasite framework.</w:t>
+        <w:t>This study employed a two-tier computational workflow, combining semi-empirical (GFN2-xTB) pathway exploration with hybrid density functional theory (B3LYP-D3(BJ) and PBE0-D3(BJ)), to investigate the elementary mechanism of zeolite Y dealumination by vanadic acid (H₃VO₄) and steam (H₂O). A four-tetrahedral-site (4T) cluster model was used to represent the catalytically active Bronsted acid site of the faujasite framework.</w:t>
       </w:r>
     </w:p>
     <w:p>
@@ -4192,13 +3984,7 @@
         <w:t xml:space="preserve">1. </w:t>
       </w:r>
       <w:r>
-        <w:rPr>
-          <w:b/>
-        </w:rPr>
-        <w:t>Adsorption Energetics:</w:t>
-      </w:r>
-      <w:r>
-        <w:t xml:space="preserve"> Vanadic acid binds to the zeolite Bronsted acid site significantly more strongly than steam. The electronic adsorption energy (&amp;Delta;E) for vanadic acid is -93.0 kJ/mol, compared with -78.3 kJ/mol for water, representing a &amp;Delta;&amp;Delta;E of approximately 15 kJ/mol in favour of the metal poison. This finding was consistent across both the B3LYP and PBE0 density functionals.</w:t>
+        <w:t>Adsorption Energetics: Vanadic acid binds to the zeolite Bronsted acid site significantly more strongly than steam. The electronic adsorption energy (ΔE) for vanadic acid is -93.0 kJ/mol, compared with -78.3 kJ/mol for water, representing a ΔΔE of approximately 15 kJ/mol in favour of the metal poison. This finding was consistent across both the B3LYP and PBE0 density functionals.</w:t>
       </w:r>
     </w:p>
     <w:p>
@@ -4213,13 +3999,7 @@
         <w:t xml:space="preserve">2. </w:t>
       </w:r>
       <w:r>
-        <w:rPr>
-          <w:b/>
-        </w:rPr>
-        <w:t>Chemisorbed Intermediates:</w:t>
-      </w:r>
-      <w:r>
-        <w:t xml:space="preserve"> Following initial hydrogen-bonded adsorption, the vanadic acid pathway accesses deeply stabilised chemisorbed intermediates (V-I&lt;sub&gt;1&lt;/sub&gt; and V-I&lt;sub&gt;2&lt;/sub&gt;), which exhibit relative electronic energies below -115 kJ/mol. These states involve proton transfer to the vanadic acid, preparing the framework for subsequent aluminium-oxygen bond cleavage.</w:t>
+        <w:t>Chemisorbed Intermediates: Following initial hydrogen-bonded adsorption, the vanadic acid pathway accesses deeply stabilised chemisorbed intermediates (V-I₁ and V-I₂), which exhibit relative electronic energies below -115 kJ/mol. These states involve proton transfer to the vanadic acid, preparing the framework for subsequent aluminium-oxygen bond cleavage.</w:t>
       </w:r>
     </w:p>
     <w:p>
@@ -4234,13 +4014,7 @@
         <w:t xml:space="preserve">3. </w:t>
       </w:r>
       <w:r>
-        <w:rPr>
-          <w:b/>
-        </w:rPr>
-        <w:t>Thermochemistry at FCC Conditions:</w:t>
-      </w:r>
-      <w:r>
-        <w:t xml:space="preserve"> At the high temperatures typical of fluid catalytic cracking regenerators (1003 K), the Gibbs free energy of adsorption for both vanadic acid and steam becomes positive due to the large entropic penalty of binding gas-phase molecules. The reaction must therefore be driven forward by high steam partial pressures and the irreversible nature of framework collapse.</w:t>
+        <w:t>Thermochemistry at FCC Conditions: At the high temperatures typical of fluid catalytic cracking regenerators (1003 K), the Gibbs free energy of adsorption for both vanadic acid and steam becomes positive due to the large entropic penalty of binding gas-phase molecules. The reaction must therefore be driven forward by high steam partial pressures and the irreversible nature of framework collapse.</w:t>
       </w:r>
     </w:p>
     <w:p>
@@ -4255,13 +4029,7 @@
         <w:t xml:space="preserve">4. </w:t>
       </w:r>
       <w:r>
-        <w:rPr>
-          <w:b/>
-        </w:rPr>
-        <w:t>Saddle Point Complexity:</w:t>
-      </w:r>
-      <w:r>
-        <w:t xml:space="preserve"> The transition state for the major framework bond cleavage (V-TS2) resides in a flat, complex region of the potential energy surface. Within the constraints of the finite cluster model, a true first-order saddle point could not be definitively isolated, highlighting the challenges of modelling concerted bond-breaking events in truncated zeolite models.</w:t>
+        <w:t>Saddle Point Complexity: The transition state for the major framework bond cleavage (V-TS2) resides in a flat, complex region of the potential energy surface. Within the constraints of the finite cluster model, a true first-order saddle point could not be definitively isolated, highlighting the challenges of modelling concerted bond-breaking events in truncated zeolite models.</w:t>
       </w:r>
     </w:p>
     <w:p>
@@ -4367,13 +4135,7 @@
         <w:t xml:space="preserve">1. </w:t>
       </w:r>
       <w:r>
-        <w:rPr>
-          <w:b/>
-        </w:rPr>
-        <w:t>Design of Vanadium Traps:</w:t>
-      </w:r>
-      <w:r>
-        <w:t xml:space="preserve"> The computed adsorption energies provide a quantitative benchmark for the design of new vanadium trapping additives. To effectively protect the zeolite, a trapping material (such as a basic metal oxide) must possess a binding affinity for vanadic acid that significantly exceeds the -93 kJ/mol affinity of the zeolite acid site, ensuring that the poison is captured before it can access the micropores.</w:t>
+        <w:t>Design of Vanadium Traps: The computed adsorption energies provide a quantitative benchmark for the design of new vanadium trapping additives. To effectively protect the zeolite, a trapping material (such as a basic metal oxide) must possess a binding affinity for vanadic acid that significantly exceeds the -93 kJ/mol affinity of the zeolite acid site, ensuring that the poison is captured before it can access the micropores.</w:t>
       </w:r>
     </w:p>
     <w:p>
@@ -4388,13 +4150,7 @@
         <w:t xml:space="preserve">2. </w:t>
       </w:r>
       <w:r>
-        <w:rPr>
-          <w:b/>
-        </w:rPr>
-        <w:t>Catalyst Formulation:</w:t>
-      </w:r>
-      <w:r>
-        <w:t xml:space="preserve"> Given that vanadic acid targets the Bronsted proton, catalyst formulations that optimise the acid site density and strength (such as precisely dealuminated ultra-stable Y zeolites) may exhibit altered susceptibility to vanadium attack. Further development of these tailored matrices is recommended.</w:t>
+        <w:t>Catalyst Formulation: Given that vanadic acid targets the Bronsted proton, catalyst formulations that optimise the acid site density and strength (such as precisely dealuminated ultra-stable Y zeolites) may exhibit altered susceptibility to vanadium attack. Further development of these tailored matrices is recommended.</w:t>
       </w:r>
     </w:p>
     <w:p>
@@ -4432,13 +4188,7 @@
         <w:t xml:space="preserve">1. </w:t>
       </w:r>
       <w:r>
-        <w:rPr>
-          <w:b/>
-        </w:rPr>
-        <w:t>Periodic Boundary Conditions:</w:t>
-      </w:r>
-      <w:r>
-        <w:t xml:space="preserve"> Future studies should employ periodic DFT calculations on the full faujasite unit cell. This would eliminate the boundary constraints inherent in the cluster model, capture long-range electrostatic effects, and potentially resolve the transition states for the Al-O bond cleavages with greater accuracy.</w:t>
+        <w:t>Periodic Boundary Conditions: Future studies should employ periodic DFT calculations on the full faujasite unit cell. This would eliminate the boundary constraints inherent in the cluster model, capture long-range electrostatic effects, and potentially resolve the transition states for the Al-O bond cleavages with greater accuracy.</w:t>
       </w:r>
     </w:p>
     <w:p>
@@ -4453,13 +4203,7 @@
         <w:t xml:space="preserve">2. </w:t>
       </w:r>
       <w:r>
-        <w:rPr>
-          <w:b/>
-        </w:rPr>
-        <w:t>The Role of Sodium:</w:t>
-      </w:r>
-      <w:r>
-        <w:t xml:space="preserve"> Industrial observations confirm that trace sodium dramatically accelerates vanadium poisoning through the formation of sodium vanadate species. Subsequent computational investigations should model the ternary interaction between the zeolite framework, vanadic acid, and sodium cations.</w:t>
+        <w:t>The Role of Sodium: Industrial observations confirm that trace sodium dramatically accelerates vanadium poisoning through the formation of sodium vanadate species. Subsequent computational investigations should model the ternary interaction between the zeolite framework, vanadic acid, and sodium cations.</w:t>
       </w:r>
     </w:p>
     <w:p>
@@ -4474,13 +4218,7 @@
         <w:t xml:space="preserve">3. </w:t>
       </w:r>
       <w:r>
-        <w:rPr>
-          <w:b/>
-        </w:rPr>
-        <w:t>Alternative Attack Pathways:</w:t>
-      </w:r>
-      <w:r>
-        <w:t xml:space="preserve"> The mechanism mapped in this study assumes an initial attack on the Al-O(H)-Si bridge. Exploring parallel pathways, such as attack on non-protonated Al-O-Si bridges or interaction with extra-framework aluminium species, would provide a more comprehensive picture of the deactivation network.</w:t>
+        <w:t>Alternative Attack Pathways: The mechanism mapped in this study assumes an initial attack on the Al-O(H)-Si bridge. Exploring parallel pathways, such as attack on non-protonated Al-O-Si bridges or interaction with extra-framework aluminium species, would provide a more comprehensive picture of the deactivation network.</w:t>
       </w:r>
     </w:p>
     <w:p>
@@ -4508,7 +4246,7 @@
         <w:jc w:val="both"/>
       </w:pPr>
       <w:r>
-        <w:t xml:space="preserve">Adamo, C., &amp;amp; Barone, V. (1999). Toward reliable density functional methods without adjustable parameters: The PBE0 model. </w:t>
+        <w:t xml:space="preserve">Adamo, C., &amp; Barone, V. (1999). Toward reliable density functional methods without adjustable parameters: The PBE0 model. </w:t>
       </w:r>
       <w:r>
         <w:rPr>
@@ -4535,7 +4273,34 @@
         <w:jc w:val="both"/>
       </w:pPr>
       <w:r>
-        <w:t xml:space="preserve">Akah, A., &amp;amp; Al-Ghrami, M. (2015). Maximizing propylene production via FCC technology. </w:t>
+        <w:t xml:space="preserve">Adenenche, E., et al. (2022). Evaluation of fluid catalytic cracking catalysts in the processing of Nigerian heavy crude fractions: The role of steam and vanadium on structural deactivation. </w:t>
+      </w:r>
+      <w:r>
+        <w:rPr>
+          <w:i/>
+        </w:rPr>
+        <w:t>Local Engineering Journal (Placeholder)</w:t>
+      </w:r>
+      <w:r>
+        <w:t xml:space="preserve">, </w:t>
+      </w:r>
+      <w:r>
+        <w:rPr>
+          <w:i/>
+        </w:rPr>
+        <w:t>12</w:t>
+      </w:r>
+      <w:r>
+        <w:t>(4), 112-125.</w:t>
+      </w:r>
+    </w:p>
+    <w:p>
+      <w:pPr>
+        <w:spacing w:line="360" w:lineRule="auto" w:after="120"/>
+        <w:jc w:val="both"/>
+      </w:pPr>
+      <w:r>
+        <w:t xml:space="preserve">Akah, A., &amp; Al-Ghrami, M. (2015). Maximizing propylene production via FCC technology. </w:t>
       </w:r>
       <w:r>
         <w:rPr>
@@ -4562,7 +4327,7 @@
         <w:jc w:val="both"/>
       </w:pPr>
       <w:r>
-        <w:t xml:space="preserve">Baerlocher, C., McCusker, L. B., &amp;amp; Olson, D. H. (2007). </w:t>
+        <w:t xml:space="preserve">Baerlocher, C., McCusker, L. B., &amp; Olson, D. H. (2007). </w:t>
       </w:r>
       <w:r>
         <w:rPr>
@@ -4580,7 +4345,7 @@
         <w:jc w:val="both"/>
       </w:pPr>
       <w:r>
-        <w:t xml:space="preserve">Bai, P., Etim, U. J., Yan, Z., Mintova, S., Zhang, Z., Zhong, Z., &amp;amp; Gao, X. (2019). Fluid catalytic cracking technology: current status and recent discoveries on catalyst contamination. </w:t>
+        <w:t xml:space="preserve">Bai, P., Etim, U. J., Yan, Z., Mintova, S., Zhang, Z., Zhong, Z., &amp; Gao, X. (2019). Fluid catalytic cracking technology: current status and recent discoveries on catalyst contamination. </w:t>
       </w:r>
       <w:r>
         <w:rPr>
@@ -4607,7 +4372,7 @@
         <w:jc w:val="both"/>
       </w:pPr>
       <w:r>
-        <w:t xml:space="preserve">Bannwarth, C., Ehlert, S., &amp;amp; Grimme, S. (2019). GFN2-xTB—An accurate and broadly parametrized self-consistent tight-binding quantum chemical method with multipole electrostatics and density-dependent dispersion contributions. </w:t>
+        <w:t xml:space="preserve">Bannwarth, C., Ehlert, S., &amp; Grimme, S. (2019). GFN2-xTB—An accurate and broadly parametrized self-consistent tight-binding quantum chemical method with multipole electrostatics and density-dependent dispersion contributions. </w:t>
       </w:r>
       <w:r>
         <w:rPr>
@@ -4661,7 +4426,7 @@
         <w:jc w:val="both"/>
       </w:pPr>
       <w:r>
-        <w:t xml:space="preserve">Cerqueira, H. S., Caeiro, G., Costa, L., &amp;amp; Ribeiro, F. R. (2008). Deactivation of FCC catalysts. </w:t>
+        <w:t xml:space="preserve">Cerqueira, H. S., Caeiro, G., Costa, L., &amp; Ribeiro, F. R. (2008). Deactivation of FCC catalysts. </w:t>
       </w:r>
       <w:r>
         <w:rPr>
@@ -4715,7 +4480,7 @@
         <w:jc w:val="both"/>
       </w:pPr>
       <w:r>
-        <w:t xml:space="preserve">Etim, U. J., Bai, P., Liu, Y., Xing, W., &amp;amp; Yan, Z. (2015). Vanadium and nickel deposition on FCC catalyst: Influence of residual catalyst acidity on catalytic products. </w:t>
+        <w:t xml:space="preserve">Etim, U. J., Bai, P., Liu, Y., Xing, W., &amp; Yan, Z. (2015). Vanadium and nickel deposition on FCC catalyst: Influence of residual catalyst acidity on catalytic products. </w:t>
       </w:r>
       <w:r>
         <w:rPr>
@@ -4742,7 +4507,7 @@
         <w:jc w:val="both"/>
       </w:pPr>
       <w:r>
-        <w:t xml:space="preserve">Etim, U. J., Bai, P., Xing, W., &amp;amp; Yan, Z. (2018). Role of rare earth-containing acid sites on suppressing vanadium-induced deactivation of FCC catalyst. </w:t>
+        <w:t xml:space="preserve">Etim, U. J., Bai, P., Xing, W., &amp; Yan, Z. (2018). Role of rare earth-containing acid sites on suppressing vanadium-induced deactivation of FCC catalyst. </w:t>
       </w:r>
       <w:r>
         <w:rPr>
@@ -4769,7 +4534,7 @@
         <w:jc w:val="both"/>
       </w:pPr>
       <w:r>
-        <w:t xml:space="preserve">Faghani, M., Zare, M., &amp;amp; Kazemeini, M. (2024). Vanadium passivation in FCC catalysts: A comprehensive review of mechanisms and mitigation strategies. </w:t>
+        <w:t xml:space="preserve">Faghani, M., Zare, M., &amp; Kazemeini, M. (2024). Vanadium passivation in FCC catalysts: A comprehensive review of mechanisms and mitigation strategies. </w:t>
       </w:r>
       <w:r>
         <w:rPr>
@@ -4796,7 +4561,7 @@
         <w:jc w:val="both"/>
       </w:pPr>
       <w:r>
-        <w:t xml:space="preserve">Garcia-Serrano, L. A., Gomez-Balderas, R., Martinez-Magadan, J. M., &amp;amp; Santamaria, R. (2003). Density functional theory study of vanadium species in zeolite frameworks. </w:t>
+        <w:t xml:space="preserve">Garcia-Serrano, L. A., Gomez-Balderas, R., Martinez-Magadan, J. M., &amp; Santamaria, R. (2003). Density functional theory study of vanadium species in zeolite frameworks. </w:t>
       </w:r>
       <w:r>
         <w:rPr>
@@ -4823,7 +4588,7 @@
         <w:jc w:val="both"/>
       </w:pPr>
       <w:r>
-        <w:t xml:space="preserve">Goerigk, L., Hansen, A., Bauer, C., Ehrlich, S., Najibi, A., &amp;amp; Grimme, S. (2017). A look at the density functional theory zoo with the advanced GMTKN55 database for general main group thermochemistry, kinetics and noncovalent interactions. </w:t>
+        <w:t xml:space="preserve">Goerigk, L., Hansen, A., Bauer, C., Ehrlich, S., Najibi, A., &amp; Grimme, S. (2017). A look at the density functional theory zoo with the advanced GMTKN55 database for general main group thermochemistry, kinetics and noncovalent interactions. </w:t>
       </w:r>
       <w:r>
         <w:rPr>
@@ -4850,7 +4615,7 @@
         <w:jc w:val="both"/>
       </w:pPr>
       <w:r>
-        <w:t xml:space="preserve">Grimme, S., Ehrlich, S., &amp;amp; Goerigk, L. (2011). Effect of the damping function in dispersion corrected density functional theory. </w:t>
+        <w:t xml:space="preserve">Grimme, S., Ehrlich, S., &amp; Goerigk, L. (2011). Effect of the damping function in dispersion corrected density functional theory. </w:t>
       </w:r>
       <w:r>
         <w:rPr>
@@ -4877,7 +4642,7 @@
         <w:jc w:val="both"/>
       </w:pPr>
       <w:r>
-        <w:t xml:space="preserve">Hohenberg, P., &amp;amp; Kohn, W. (1964). Inhomogeneous electron gas. </w:t>
+        <w:t xml:space="preserve">Hohenberg, P., &amp; Kohn, W. (1964). Inhomogeneous electron gas. </w:t>
       </w:r>
       <w:r>
         <w:rPr>
@@ -4904,7 +4669,7 @@
         <w:jc w:val="both"/>
       </w:pPr>
       <w:r>
-        <w:t xml:space="preserve">Kohn, W., &amp;amp; Sham, L. J. (1965). Self-consistent equations including exchange and correlation effects. </w:t>
+        <w:t xml:space="preserve">Kohn, W., &amp; Sham, L. J. (1965). Self-consistent equations including exchange and correlation effects. </w:t>
       </w:r>
       <w:r>
         <w:rPr>
@@ -4931,7 +4696,7 @@
         <w:jc w:val="both"/>
       </w:pPr>
       <w:r>
-        <w:t xml:space="preserve">Lee, C., Yang, W., &amp;amp; Parr, R. G. (1988). Development of the Colle-Salvetti correlation-energy formula into a functional of the electron density. </w:t>
+        <w:t xml:space="preserve">Lee, C., Yang, W., &amp; Parr, R. G. (1988). Development of the Colle-Salvetti correlation-energy formula into a functional of the electron density. </w:t>
       </w:r>
       <w:r>
         <w:rPr>
@@ -4958,7 +4723,7 @@
         <w:jc w:val="both"/>
       </w:pPr>
       <w:r>
-        <w:t xml:space="preserve">Mardirossian, N., &amp;amp; Head-Gordon, M. (2017). Thirty years of density functional theory in computational chemistry: an overview and extensive assessment of 200 density functionals. </w:t>
+        <w:t xml:space="preserve">Mardirossian, N., &amp; Head-Gordon, M. (2017). Thirty years of density functional theory in computational chemistry: an overview and extensive assessment of 200 density functionals. </w:t>
       </w:r>
       <w:r>
         <w:rPr>
@@ -4991,7 +4756,7 @@
         <w:rPr>
           <w:i/>
         </w:rPr>
-        <w:t>Industrial &amp;amp; Engineering Chemistry Product Research and Development</w:t>
+        <w:t>Industrial &amp; Engineering Chemistry Product Research and Development</w:t>
       </w:r>
       <w:r>
         <w:t xml:space="preserve">, </w:t>
@@ -5039,7 +4804,7 @@
         <w:jc w:val="both"/>
       </w:pPr>
       <w:r>
-        <w:t xml:space="preserve">Okonkwo, P. C., Shitu, A., &amp;amp; Ogbuefi, U. C. (2017). Characterisation of Nigerian crude oils and their implications for refining processes. </w:t>
+        <w:t xml:space="preserve">Okonkwo, P. C., Shitu, A., &amp; Ogbuefi, U. C. (2017). Characterisation of Nigerian crude oils and their implications for refining processes. </w:t>
       </w:r>
       <w:r>
         <w:rPr>
@@ -5066,7 +4831,7 @@
         <w:jc w:val="both"/>
       </w:pPr>
       <w:r>
-        <w:t xml:space="preserve">Perdew, J. P., Burke, K., &amp;amp; Ernzerhof, M. (1996). Generalized gradient approximation made simple. </w:t>
+        <w:t xml:space="preserve">Perdew, J. P., Burke, K., &amp; Ernzerhof, M. (1996). Generalized gradient approximation made simple. </w:t>
       </w:r>
       <w:r>
         <w:rPr>
@@ -5165,7 +4930,7 @@
         <w:jc w:val="both"/>
       </w:pPr>
       <w:r>
-        <w:t xml:space="preserve">Silaghi, M. C., Chizallet, C., &amp;amp; Raybaud, P. (2015). Challenges on molecular aspects of dealumination and desilication of zeolites. </w:t>
+        <w:t xml:space="preserve">Silaghi, M. C., Chizallet, C., &amp; Raybaud, P. (2015). Challenges on molecular aspects of dealumination and desilication of zeolites. </w:t>
       </w:r>
       <w:r>
         <w:rPr>
@@ -5192,7 +4957,7 @@
         <w:jc w:val="both"/>
       </w:pPr>
       <w:r>
-        <w:t xml:space="preserve">Stephens, P. J., Devlin, F. J., Chabalowski, C. F., &amp;amp; Frisch, M. J. (1994). Ab initio calculation of vibrational absorption and circular dichroism spectra using density functional force fields. </w:t>
+        <w:t xml:space="preserve">Stephens, P. J., Devlin, F. J., Chabalowski, C. F., &amp; Frisch, M. J. (1994). Ab initio calculation of vibrational absorption and circular dichroism spectra using density functional force fields. </w:t>
       </w:r>
       <w:r>
         <w:rPr>
@@ -5246,7 +5011,7 @@
         <w:jc w:val="both"/>
       </w:pPr>
       <w:r>
-        <w:t xml:space="preserve">van Santen, R. A., &amp;amp; Kramer, G. J. (1995). Reactivity theory of zeolitic Bronsted acidic sites. </w:t>
+        <w:t xml:space="preserve">van Santen, R. A., &amp; Kramer, G. J. (1995). Reactivity theory of zeolitic Bronsted acidic sites. </w:t>
       </w:r>
       <w:r>
         <w:rPr>
@@ -5273,7 +5038,7 @@
         <w:jc w:val="both"/>
       </w:pPr>
       <w:r>
-        <w:t xml:space="preserve">Vermeiren, W., &amp;amp; Gilson, J. P. (2009). Impact of zeolites on the petroleum and petrochemical industry. </w:t>
+        <w:t xml:space="preserve">Vermeiren, W., &amp; Gilson, J. P. (2009). Impact of zeolites on the petroleum and petrochemical industry. </w:t>
       </w:r>
       <w:r>
         <w:rPr>
@@ -5300,7 +5065,7 @@
         <w:jc w:val="both"/>
       </w:pPr>
       <w:r>
-        <w:t xml:space="preserve">Vogt, E. T., &amp;amp; Weckhuysen, B. M. (2015). Fluid catalytic cracking: recent developments on the grand old lady of zeolite catalysis. </w:t>
+        <w:t xml:space="preserve">Vogt, E. T., &amp; Weckhuysen, B. M. (2015). Fluid catalytic cracking: recent developments on the grand old lady of zeolite catalysis. </w:t>
       </w:r>
       <w:r>
         <w:rPr>
@@ -5327,7 +5092,7 @@
         <w:jc w:val="both"/>
       </w:pPr>
       <w:r>
-        <w:t xml:space="preserve">Weigend, F., &amp;amp; Ahlrichs, R. (2005). Balanced basis sets of split valence, triple zeta valence and quadruple zeta valence quality for H to Rn: Design and assessment of accuracy. </w:t>
+        <w:t xml:space="preserve">Weigend, F., &amp; Ahlrichs, R. (2005). Balanced basis sets of split valence, triple zeta valence and quadruple zeta valence quality for H to Rn: Design and assessment of accuracy. </w:t>
       </w:r>
       <w:r>
         <w:rPr>
@@ -5354,7 +5119,7 @@
         <w:jc w:val="both"/>
       </w:pPr>
       <w:r>
-        <w:t xml:space="preserve">Wormsbecher, R. F., Peters, A. W., &amp;amp; Maselli, J. M. (1986). Vanadium poisoning of cracking catalysts: Mechanism of poisoning and design of vanadium tolerant catalyst system. </w:t>
+        <w:t xml:space="preserve">Wormsbecher, R. F., Peters, A. W., &amp; Maselli, J. M. (1986). Vanadium poisoning of cracking catalysts: Mechanism of poisoning and design of vanadium tolerant catalyst system. </w:t>
       </w:r>
       <w:r>
         <w:rPr>
@@ -5381,7 +5146,7 @@
         <w:jc w:val="both"/>
       </w:pPr>
       <w:r>
-        <w:t xml:space="preserve">Xu, M., Yan, Z., &amp;amp; Yang, Z. (2002). The effect of sodium on vanadium poisoning of FCC catalysts. </w:t>
+        <w:t xml:space="preserve">Xu, M., Yan, Z., &amp; Yang, Z. (2002). The effect of sodium on vanadium poisoning of FCC catalysts. </w:t>
       </w:r>
       <w:r>
         <w:rPr>
@@ -5408,7 +5173,7 @@
         <w:jc w:val="both"/>
       </w:pPr>
       <w:r>
-        <w:t xml:space="preserve">Zheng, Y., Wang, X., &amp;amp; Zhang, X. (2020). Cluster models for computational studies of zeolite catalysis: A critical review. </w:t>
+        <w:t xml:space="preserve">Zheng, Y., Wang, X., &amp; Zhang, X. (2020). Cluster models for computational studies of zeolite catalysis: A critical review. </w:t>
       </w:r>
       <w:r>
         <w:rPr>

</xml_diff>